<commit_message>
Kullanım kılavuzunu güncelle, Yardım linkine cache-busting ekle
- Kullanım kılavuzu (docx + pdf) 2026-08-10 sonrası özellikleri
  kapsayacak şekilde güncellendi: Kullanıcı Adı ile giriş ve şifre
  değiştirme, Ön Büro rolü, arama-öncelikli listeler, kamera ile barkod,
  Tekne/Telefon zorunluluğu, süre kuralları, kullanıcı silme ve yeni
  Raporlar bölümü; mevcut resimler korundu
- MainLayout: Yardım linki PDF'in değişiklik zamanıyla versiyonlanıyor
  (?v=...), güncellenen kılavuz tarayıcı önbelleğinden eski haliyle
  gelmesin diye
- Yapılacaklar listesine planlanan işler eklendi

Co-Authored-By: Claude Opus 5.5 <noreply@anthropic.com>
</commit_message>
<xml_diff>
--- a/docs/ViaCekek_Kullanim_Kilavuzu.docx
+++ b/docs/ViaCekek_Kullanim_Kilavuzu.docx
@@ -1,150 +1,166 @@
 
 <file path=word/document.xml><?xml version="1.0" encoding="utf-8"?>
-<w:document xmlns:wpc="http://schemas.microsoft.com/office/word/2010/wordprocessingCanvas" xmlns:cx="http://schemas.microsoft.com/office/drawing/2014/chartex" xmlns:cx1="http://schemas.microsoft.com/office/drawing/2015/9/8/chartex" xmlns:cx2="http://schemas.microsoft.com/office/drawing/2015/10/21/chartex" xmlns:cx3="http://schemas.microsoft.com/office/drawing/2016/5/9/chartex" xmlns:cx4="http://schemas.microsoft.com/office/drawing/2016/5/10/chartex" xmlns:cx5="http://schemas.microsoft.com/office/drawing/2016/5/11/chartex" xmlns:cx6="http://schemas.microsoft.com/office/drawing/2016/5/12/chartex" xmlns:cx7="http://schemas.microsoft.com/office/drawing/2016/5/13/chartex" xmlns:cx8="http://schemas.microsoft.com/office/drawing/2016/5/14/chartex" xmlns:mc="http://schemas.openxmlformats.org/markup-compatibility/2006" xmlns:aink="http://schemas.microsoft.com/office/drawing/2016/ink" xmlns:am3d="http://schemas.microsoft.com/office/drawing/2017/model3d" xmlns:o="urn:schemas-microsoft-com:office:office" xmlns:oel="http://schemas.microsoft.com/office/2019/extlst" xmlns:r="http://schemas.openxmlformats.org/officeDocument/2006/relationships" xmlns:m="http://schemas.openxmlformats.org/officeDocument/2006/math" xmlns:v="urn:schemas-microsoft-com:vml" xmlns:wp14="http://schemas.microsoft.com/office/word/2010/wordprocessingDrawing" xmlns:wp="http://schemas.openxmlformats.org/drawingml/2006/wordprocessingDrawing" xmlns:w10="urn:schemas-microsoft-com:office:word" xmlns:w="http://schemas.openxmlformats.org/wordprocessingml/2006/main" xmlns:w14="http://schemas.microsoft.com/office/word/2010/wordml" xmlns:w15="http://schemas.microsoft.com/office/word/2012/wordml" xmlns:w16cei="http://schemas.microsoft.com/office/word/2026/wordml/cei" xmlns:w16cex="http://schemas.microsoft.com/office/word/2018/wordml/cex" xmlns:w16cid="http://schemas.microsoft.com/office/word/2016/wordml/cid" xmlns:w16="http://schemas.microsoft.com/office/word/2018/wordml" xmlns:w16du="http://schemas.microsoft.com/office/word/2023/wordml/word16du" xmlns:w16sdtdh="http://schemas.microsoft.com/office/word/2020/wordml/sdtdatahash" xmlns:w16sdtfl="http://schemas.microsoft.com/office/word/2024/wordml/sdtformatlock" xmlns:w16se="http://schemas.microsoft.com/office/word/2015/wordml/symex" xmlns:wpg="http://schemas.microsoft.com/office/word/2010/wordprocessingGroup" xmlns:wpi="http://schemas.microsoft.com/office/word/2010/wordprocessingInk" xmlns:wne="http://schemas.microsoft.com/office/word/2006/wordml" xmlns:wps="http://schemas.microsoft.com/office/word/2010/wordprocessingShape" mc:Ignorable="w14 w15 w16se w16cid w16 w16cex w16sdtdh w16sdtfl w16du wp14">
+<w:document xmlns:wpc="http://schemas.microsoft.com/office/word/2010/wordprocessingCanvas" xmlns:cx="http://schemas.microsoft.com/office/drawing/2014/chartex" xmlns:cx1="http://schemas.microsoft.com/office/drawing/2015/9/8/chartex" xmlns:cx2="http://schemas.microsoft.com/office/drawing/2015/10/21/chartex" xmlns:cx3="http://schemas.microsoft.com/office/drawing/2016/5/9/chartex" xmlns:cx4="http://schemas.microsoft.com/office/drawing/2016/5/10/chartex" xmlns:cx5="http://schemas.microsoft.com/office/drawing/2016/5/11/chartex" xmlns:cx6="http://schemas.microsoft.com/office/drawing/2016/5/12/chartex" xmlns:cx7="http://schemas.microsoft.com/office/drawing/2016/5/13/chartex" xmlns:cx8="http://schemas.microsoft.com/office/drawing/2016/5/14/chartex" xmlns:mc="http://schemas.openxmlformats.org/markup-compatibility/2006" xmlns:aink="http://schemas.microsoft.com/office/drawing/2016/ink" xmlns:am3d="http://schemas.microsoft.com/office/drawing/2017/model3d" xmlns:o="urn:schemas-microsoft-com:office:office" xmlns:oel="http://schemas.microsoft.com/office/2019/extlst" xmlns:r="http://schemas.openxmlformats.org/officeDocument/2006/relationships" xmlns:m="http://schemas.openxmlformats.org/officeDocument/2006/math" xmlns:v="urn:schemas-microsoft-com:vml" xmlns:wp14="http://schemas.microsoft.com/office/word/2010/wordprocessingDrawing" xmlns:wp="http://schemas.openxmlformats.org/drawingml/2006/wordprocessingDrawing" xmlns:w10="urn:schemas-microsoft-com:office:word" xmlns:w="http://schemas.openxmlformats.org/wordprocessingml/2006/main" xmlns:w14="http://schemas.microsoft.com/office/word/2010/wordml" xmlns:w15="http://schemas.microsoft.com/office/word/2012/wordml" xmlns:w16cex="http://schemas.microsoft.com/office/word/2018/wordml/cex" xmlns:w16cid="http://schemas.microsoft.com/office/word/2016/wordml/cid" xmlns:w16="http://schemas.microsoft.com/office/word/2018/wordml" xmlns:w16du="http://schemas.microsoft.com/office/word/2023/wordml/word16du" xmlns:w16sdtdh="http://schemas.microsoft.com/office/word/2020/wordml/sdtdatahash" xmlns:w16sdtfl="http://schemas.microsoft.com/office/word/2024/wordml/sdtformatlock" xmlns:w16se="http://schemas.microsoft.com/office/word/2015/wordml/symex" xmlns:wpg="http://schemas.microsoft.com/office/word/2010/wordprocessingGroup" xmlns:wpi="http://schemas.microsoft.com/office/word/2010/wordprocessingInk" xmlns:wne="http://schemas.microsoft.com/office/word/2006/wordml" xmlns:wps="http://schemas.microsoft.com/office/word/2010/wordprocessingShape" mc:Ignorable="w14 w15 w16se w16cid w16 w16cex w16sdtdh w16sdtfl w16du wp14">
   <w:body>
     <w:p>
       <w:pPr>
         <w:pStyle w:val="KonuBal"/>
         <w:jc w:val="center"/>
-      </w:pPr>
-      <w:r>
+        <w:rPr>
+          <w:lang w:val="tr-TR"/>
+        </w:rPr>
+      </w:pPr>
+      <w:r>
+        <w:rPr>
+          <w:lang w:val="tr-TR"/>
+        </w:rPr>
         <w:t>ViaÇekek Kullanım Kılavuzu</w:t>
       </w:r>
     </w:p>
     <w:p>
       <w:pPr>
         <w:jc w:val="center"/>
-      </w:pPr>
-      <w:r>
-        <w:t>Bu doküman ViaÇekek uygulamasının ekranlarını ve özelliklerini kısaca anlatır. Ekran görüntüleri işaretli kutulara sonradan eklenebilir.</w:t>
+        <w:rPr>
+          <w:lang w:val="tr-TR"/>
+        </w:rPr>
+      </w:pPr>
+      <w:r>
+        <w:rPr>
+          <w:lang w:val="tr-TR"/>
+        </w:rPr>
+        <w:t xml:space="preserve">Bu </w:t>
+      </w:r>
+      <w:proofErr w:type="gramStart"/>
+      <w:r>
+        <w:rPr>
+          <w:lang w:val="tr-TR"/>
+        </w:rPr>
+        <w:t>doküman</w:t>
+      </w:r>
+      <w:proofErr w:type="gramEnd"/>
+      <w:r>
+        <w:rPr>
+          <w:lang w:val="tr-TR"/>
+        </w:rPr>
+        <w:t xml:space="preserve"> ViaÇekek uygulamasının ekranlarını ve özelliklerini kısaca anlatır. Ekran görüntüleri işaretli kutulara sonradan eklenebilir.</w:t>
       </w:r>
     </w:p>
     <w:p>
       <w:pPr>
         <w:pStyle w:val="Balk1"/>
-      </w:pPr>
-      <w:r>
+        <w:rPr>
+          <w:lang w:val="tr-TR"/>
+        </w:rPr>
+      </w:pPr>
+      <w:r>
+        <w:rPr>
+          <w:lang w:val="tr-TR"/>
+        </w:rPr>
         <w:t>1. Giriş Yapma</w:t>
       </w:r>
     </w:p>
     <w:p>
       <w:pPr>
         <w:pStyle w:val="ListeMaddemi"/>
-      </w:pPr>
-      <w:proofErr w:type="spellStart"/>
-      <w:r>
-        <w:t>Tarayıcıdan</w:t>
-      </w:r>
-      <w:proofErr w:type="spellEnd"/>
-      <w:r>
-        <w:t xml:space="preserve"> </w:t>
-      </w:r>
-      <w:proofErr w:type="spellStart"/>
-      <w:r>
-        <w:t>uygulama</w:t>
-      </w:r>
-      <w:proofErr w:type="spellEnd"/>
-      <w:r>
-        <w:t xml:space="preserve"> </w:t>
-      </w:r>
-      <w:proofErr w:type="spellStart"/>
-      <w:r>
-        <w:t>adresine</w:t>
-      </w:r>
-      <w:proofErr w:type="spellEnd"/>
-      <w:r>
-        <w:t xml:space="preserve"> </w:t>
-      </w:r>
-      <w:proofErr w:type="spellStart"/>
-      <w:r>
-        <w:t>gidin</w:t>
-      </w:r>
-      <w:proofErr w:type="spellEnd"/>
-      <w:r>
-        <w:t>.</w:t>
-      </w:r>
-      <w:r>
-        <w:t xml:space="preserve"> </w:t>
-      </w:r>
-      <w:proofErr w:type="spellStart"/>
-      <w:r>
-        <w:t>Giriş</w:t>
-      </w:r>
-      <w:proofErr w:type="spellEnd"/>
-      <w:r>
-        <w:t xml:space="preserve"> Yap </w:t>
-      </w:r>
-      <w:proofErr w:type="spellStart"/>
-      <w:r>
-        <w:t>butonunu</w:t>
-      </w:r>
-      <w:proofErr w:type="spellEnd"/>
-      <w:r>
-        <w:t xml:space="preserve"> </w:t>
-      </w:r>
-      <w:proofErr w:type="spellStart"/>
-      <w:r>
-        <w:t>seçin</w:t>
-      </w:r>
-      <w:proofErr w:type="spellEnd"/>
-      <w:r>
-        <w:t>.</w:t>
+        <w:rPr>
+          <w:lang w:val="tr-TR"/>
+        </w:rPr>
+      </w:pPr>
+      <w:r>
+        <w:rPr>
+          <w:lang w:val="tr-TR"/>
+        </w:rPr>
+        <w:t>Tarayıcıdan uygulama adresine gidin.</w:t>
+      </w:r>
+      <w:r>
+        <w:rPr>
+          <w:lang w:val="tr-TR"/>
+        </w:rPr>
+        <w:t xml:space="preserve"> Giriş Yap butonunu seçin.</w:t>
       </w:r>
     </w:p>
     <w:p>
       <w:pPr>
         <w:pStyle w:val="ListeMaddemi"/>
-      </w:pPr>
-      <w:r>
-        <w:t>E-posta ve şifrenizi girin.</w:t>
+        <w:rPr>
+          <w:lang w:val="tr-TR"/>
+        </w:rPr>
+      </w:pPr>
+      <w:r>
+        <w:rPr>
+          <w:lang w:val="tr-TR"/>
+        </w:rPr>
+        <w:t>Kullanıcı Adı ve şifrenizi girin.</w:t>
       </w:r>
     </w:p>
     <w:p>
       <w:pPr>
         <w:pStyle w:val="ListeMaddemi"/>
-      </w:pPr>
-      <w:r>
+        <w:rPr>
+          <w:lang w:val="tr-TR"/>
+        </w:rPr>
+      </w:pPr>
+      <w:r>
+        <w:rPr>
+          <w:lang w:val="tr-TR"/>
+        </w:rPr>
         <w:t>“Beni hatırla” işaretlenirse oturumunuz açık kalır.</w:t>
       </w:r>
     </w:p>
     <w:p>
       <w:pPr>
         <w:pStyle w:val="ListeMaddemi"/>
-      </w:pPr>
-      <w:r>
-        <w:t xml:space="preserve">Şifrenizi </w:t>
-      </w:r>
-      <w:proofErr w:type="spellStart"/>
-      <w:r>
-        <w:t>unutursanız</w:t>
-      </w:r>
-      <w:proofErr w:type="spellEnd"/>
-      <w:r>
-        <w:t xml:space="preserve"> </w:t>
-      </w:r>
-      <w:proofErr w:type="spellStart"/>
-      <w:r>
-        <w:t>yöneticinizle</w:t>
-      </w:r>
-      <w:proofErr w:type="spellEnd"/>
-      <w:r>
-        <w:t xml:space="preserve"> </w:t>
-      </w:r>
-      <w:proofErr w:type="spellStart"/>
-      <w:r>
-        <w:t>iletişime</w:t>
-      </w:r>
-      <w:proofErr w:type="spellEnd"/>
-      <w:r>
-        <w:t xml:space="preserve"> </w:t>
-      </w:r>
-      <w:proofErr w:type="spellStart"/>
-      <w:r>
-        <w:t>geçin</w:t>
-      </w:r>
-      <w:proofErr w:type="spellEnd"/>
-      <w:r>
-        <w:t>.</w:t>
+        <w:rPr>
+          <w:lang w:val="tr-TR"/>
+        </w:rPr>
+      </w:pPr>
+      <w:r>
+        <w:rPr>
+          <w:lang w:val="tr-TR"/>
+        </w:rPr>
+        <w:t>Şifrenizi unutursanız yöneticinizle iletişime geçin.</w:t>
+      </w:r>
+    </w:p>
+    <w:p>
+      <w:pPr>
+        <w:pStyle w:val="ListeMaddemi"/>
+        <w:rPr>
+          <w:lang w:val="tr-TR"/>
+        </w:rPr>
+      </w:pPr>
+      <w:r>
+        <w:rPr>
+          <w:lang w:val="tr-TR"/>
+        </w:rPr>
+        <w:t>Şifrenizi değiştirmek için “Şifremi değiştirmek istiyorum” kutusunu işaretleyin; Kullanıcı Adı ve mevcut şifrenizi, ardından Yeni Şifre alanını doldurup “Şifre Değiştir” butonuna basın.</w:t>
+      </w:r>
+    </w:p>
+    <w:p>
+      <w:pPr>
+        <w:pStyle w:val="ListeMaddemi"/>
+        <w:rPr>
+          <w:lang w:val="tr-TR"/>
+        </w:rPr>
+      </w:pPr>
+      <w:r>
+        <w:rPr>
+          <w:lang w:val="tr-TR"/>
+        </w:rPr>
+        <w:t>Şifre değiştirildikten sonra yeni şifrenizle otomatik olarak giriş yapılır.</w:t>
+      </w:r>
+    </w:p>
+    <w:p>
+      <w:pPr>
+        <w:pStyle w:val="ListeMaddemi"/>
+        <w:rPr>
+          <w:lang w:val="tr-TR"/>
+        </w:rPr>
+      </w:pPr>
+      <w:r>
+        <w:rPr>
+          <w:lang w:val="tr-TR"/>
+        </w:rPr>
+        <w:t>Kutu işaretliyken “Beni hatırla” seçeneği gizlenir.</w:t>
       </w:r>
     </w:p>
     <w:p>
@@ -155,6 +171,9 @@
           <w:numId w:val="0"/>
         </w:numPr>
         <w:ind w:left="360"/>
+        <w:rPr>
+          <w:lang w:val="tr-TR"/>
+        </w:rPr>
       </w:pPr>
     </w:p>
     <w:p>
@@ -165,15 +184,20 @@
           <w:numId w:val="0"/>
         </w:numPr>
         <w:ind w:left="360"/>
+        <w:jc w:val="center"/>
+        <w:rPr>
+          <w:lang w:val="tr-TR"/>
+        </w:rPr>
       </w:pPr>
       <w:r>
         <w:rPr>
           <w:noProof/>
+          <w:lang w:val="tr-TR"/>
         </w:rPr>
         <w:drawing>
-          <wp:inline distT="0" distB="0" distL="0" distR="0" wp14:anchorId="4F30AB27" wp14:editId="1922D9B4">
-            <wp:extent cx="4686300" cy="942975"/>
-            <wp:effectExtent l="0" t="0" r="0" b="9525"/>
+          <wp:inline distT="0" distB="0" distL="0" distR="0" wp14:anchorId="4F30AB27" wp14:editId="48A7AA1C">
+            <wp:extent cx="3597215" cy="723830"/>
+            <wp:effectExtent l="0" t="0" r="3810" b="635"/>
             <wp:docPr id="2120527822" name="Resim 1"/>
             <wp:cNvGraphicFramePr>
               <a:graphicFrameLocks xmlns:a="http://schemas.openxmlformats.org/drawingml/2006/main" noChangeAspect="1"/>
@@ -194,7 +218,7 @@
                   <pic:spPr>
                     <a:xfrm>
                       <a:off x="0" y="0"/>
-                      <a:ext cx="4686300" cy="942975"/>
+                      <a:ext cx="3615806" cy="727571"/>
                     </a:xfrm>
                     <a:prstGeom prst="rect">
                       <a:avLst/>
@@ -210,81 +234,113 @@
     <w:p>
       <w:pPr>
         <w:pStyle w:val="Balk1"/>
-      </w:pPr>
-      <w:r>
+        <w:rPr>
+          <w:lang w:val="tr-TR"/>
+        </w:rPr>
+      </w:pPr>
+      <w:r>
+        <w:rPr>
+          <w:lang w:val="tr-TR"/>
+        </w:rPr>
         <w:t>2. Genel Ekran Yapısı</w:t>
       </w:r>
     </w:p>
     <w:p>
       <w:pPr>
         <w:pStyle w:val="ListeMaddemi"/>
-      </w:pPr>
-      <w:r>
+        <w:rPr>
+          <w:lang w:val="tr-TR"/>
+        </w:rPr>
+      </w:pPr>
+      <w:r>
+        <w:rPr>
+          <w:lang w:val="tr-TR"/>
+        </w:rPr>
         <w:t>Üst kısımda ViaÇekek menüsü bulunur.</w:t>
       </w:r>
     </w:p>
     <w:p>
       <w:pPr>
         <w:pStyle w:val="ListeMaddemi"/>
-      </w:pPr>
-      <w:r>
-        <w:t>Dar ekranlarda (tablet), sağ üstteki üç çizgili butona basarak menüyü açarsınız.</w:t>
+        <w:rPr>
+          <w:lang w:val="tr-TR"/>
+        </w:rPr>
+      </w:pPr>
+      <w:r>
+        <w:rPr>
+          <w:lang w:val="tr-TR"/>
+        </w:rPr>
+        <w:t>Dar ekranlarda (tablet), sağ üstteki üç çizgili butona basarak menünün geri kalanını açarsınız. Çekek Takip, Kişiler ve Araçlar linkleri ekran daralsa bile her zaman görünür.</w:t>
       </w:r>
     </w:p>
     <w:p>
       <w:pPr>
         <w:pStyle w:val="ListeMaddemi"/>
-      </w:pPr>
-      <w:r>
+        <w:rPr>
+          <w:lang w:val="tr-TR"/>
+        </w:rPr>
+      </w:pPr>
+      <w:r>
+        <w:rPr>
+          <w:lang w:val="tr-TR"/>
+        </w:rPr>
         <w:t>Menüde gördüğünüz sekmeler rolünüze göre değişir.</w:t>
       </w:r>
     </w:p>
     <w:p>
       <w:pPr>
         <w:pStyle w:val="ListeMaddemi"/>
-      </w:pPr>
-      <w:r>
-        <w:t>Üç kullanıcı rolü vardır: Yönetici, Saha Kontrolörü, Güvenlik.</w:t>
+        <w:rPr>
+          <w:lang w:val="tr-TR"/>
+        </w:rPr>
+      </w:pPr>
+      <w:r>
+        <w:rPr>
+          <w:lang w:val="tr-TR"/>
+        </w:rPr>
+        <w:t>Dört kullanıcı rolü vardır: Yönetici, Saha Kontrolörü, Güvenlik, Ön Büro.</w:t>
       </w:r>
     </w:p>
     <w:p>
       <w:pPr>
         <w:pStyle w:val="ListeMaddemi"/>
-      </w:pPr>
-      <w:r>
-        <w:t xml:space="preserve">Kullanıcılar </w:t>
-      </w:r>
-      <w:proofErr w:type="spellStart"/>
-      <w:r>
-        <w:t>ekranını</w:t>
-      </w:r>
-      <w:proofErr w:type="spellEnd"/>
-      <w:r>
-        <w:t xml:space="preserve"> </w:t>
-      </w:r>
-      <w:proofErr w:type="spellStart"/>
-      <w:r>
-        <w:t>yalnızca</w:t>
-      </w:r>
-      <w:proofErr w:type="spellEnd"/>
-      <w:r>
-        <w:t xml:space="preserve"> </w:t>
-      </w:r>
-      <w:proofErr w:type="spellStart"/>
-      <w:r>
-        <w:t>Yönetici</w:t>
-      </w:r>
-      <w:proofErr w:type="spellEnd"/>
-      <w:r>
-        <w:t xml:space="preserve"> </w:t>
-      </w:r>
-      <w:proofErr w:type="spellStart"/>
-      <w:r>
-        <w:t>görür</w:t>
-      </w:r>
-      <w:proofErr w:type="spellEnd"/>
-      <w:r>
-        <w:t>.</w:t>
+        <w:rPr>
+          <w:lang w:val="tr-TR"/>
+        </w:rPr>
+      </w:pPr>
+      <w:r>
+        <w:rPr>
+          <w:lang w:val="tr-TR"/>
+        </w:rPr>
+        <w:t>Kullanıcılar ekranını yalnızca Yönetici görür.</w:t>
+      </w:r>
+    </w:p>
+    <w:p>
+      <w:pPr>
+        <w:pStyle w:val="ListeMaddemi"/>
+        <w:rPr>
+          <w:lang w:val="tr-TR"/>
+        </w:rPr>
+      </w:pPr>
+      <w:r>
+        <w:rPr>
+          <w:lang w:val="tr-TR"/>
+        </w:rPr>
+        <w:t>Sol üstteki ViaÇekek logosu ana sayfaya (Board) götürür.</w:t>
+      </w:r>
+    </w:p>
+    <w:p>
+      <w:pPr>
+        <w:pStyle w:val="ListeMaddemi"/>
+        <w:rPr>
+          <w:lang w:val="tr-TR"/>
+        </w:rPr>
+      </w:pPr>
+      <w:r>
+        <w:rPr>
+          <w:lang w:val="tr-TR"/>
+        </w:rPr>
+        <w:t>Menüdeki Yardım linki bu kılavuzu açar.</w:t>
       </w:r>
     </w:p>
     <w:p>
@@ -295,6 +351,9 @@
           <w:numId w:val="0"/>
         </w:numPr>
         <w:ind w:left="360"/>
+        <w:rPr>
+          <w:lang w:val="tr-TR"/>
+        </w:rPr>
       </w:pPr>
     </w:p>
     <w:p>
@@ -305,6 +364,9 @@
           <w:numId w:val="0"/>
         </w:numPr>
         <w:ind w:left="360"/>
+        <w:rPr>
+          <w:lang w:val="tr-TR"/>
+        </w:rPr>
       </w:pPr>
     </w:p>
     <w:p>
@@ -315,6 +377,9 @@
           <w:numId w:val="0"/>
         </w:numPr>
         <w:ind w:left="360"/>
+        <w:rPr>
+          <w:lang w:val="tr-TR"/>
+        </w:rPr>
       </w:pPr>
     </w:p>
     <w:p>
@@ -325,15 +390,20 @@
           <w:numId w:val="0"/>
         </w:numPr>
         <w:ind w:left="360"/>
+        <w:jc w:val="center"/>
+        <w:rPr>
+          <w:lang w:val="tr-TR"/>
+        </w:rPr>
       </w:pPr>
       <w:r>
         <w:rPr>
           <w:noProof/>
+          <w:lang w:val="tr-TR"/>
         </w:rPr>
         <w:drawing>
-          <wp:inline distT="0" distB="0" distL="0" distR="0" wp14:anchorId="1FADCDE7" wp14:editId="121893D0">
-            <wp:extent cx="5486400" cy="1350010"/>
-            <wp:effectExtent l="0" t="0" r="0" b="2540"/>
+          <wp:inline distT="0" distB="0" distL="0" distR="0" wp14:anchorId="1FADCDE7" wp14:editId="4A5966B3">
+            <wp:extent cx="3985404" cy="980668"/>
+            <wp:effectExtent l="0" t="0" r="0" b="0"/>
             <wp:docPr id="944110289" name="Resim 1"/>
             <wp:cNvGraphicFramePr>
               <a:graphicFrameLocks xmlns:a="http://schemas.openxmlformats.org/drawingml/2006/main" noChangeAspect="1"/>
@@ -354,7 +424,7 @@
                   <pic:spPr>
                     <a:xfrm>
                       <a:off x="0" y="0"/>
-                      <a:ext cx="5486400" cy="1350010"/>
+                      <a:ext cx="4008497" cy="986350"/>
                     </a:xfrm>
                     <a:prstGeom prst="rect">
                       <a:avLst/>
@@ -375,7 +445,375 @@
           <w:numId w:val="0"/>
         </w:numPr>
         <w:ind w:left="360"/>
-      </w:pPr>
+        <w:rPr>
+          <w:lang w:val="tr-TR"/>
+        </w:rPr>
+      </w:pPr>
+    </w:p>
+    <w:p>
+      <w:pPr>
+        <w:pStyle w:val="Balk1"/>
+        <w:rPr>
+          <w:lang w:val="tr-TR"/>
+        </w:rPr>
+      </w:pPr>
+      <w:r>
+        <w:rPr>
+          <w:lang w:val="tr-TR"/>
+        </w:rPr>
+        <w:lastRenderedPageBreak/>
+        <w:t>3. Kişiler</w:t>
+      </w:r>
+    </w:p>
+    <w:p>
+      <w:pPr>
+        <w:pStyle w:val="ListeMaddemi"/>
+        <w:rPr>
+          <w:lang w:val="tr-TR"/>
+        </w:rPr>
+      </w:pPr>
+      <w:r>
+        <w:rPr>
+          <w:lang w:val="tr-TR"/>
+        </w:rPr>
+        <w:t>Sahaya giren kişiler bu ekranda kayıt altına alınır.</w:t>
+      </w:r>
+    </w:p>
+    <w:p>
+      <w:pPr>
+        <w:pStyle w:val="ListeMaddemi"/>
+        <w:rPr>
+          <w:lang w:val="tr-TR"/>
+        </w:rPr>
+      </w:pPr>
+      <w:r>
+        <w:rPr>
+          <w:lang w:val="tr-TR"/>
+        </w:rPr>
+        <w:t xml:space="preserve">Listede kimlik </w:t>
+      </w:r>
+      <w:proofErr w:type="spellStart"/>
+      <w:r>
+        <w:rPr>
+          <w:lang w:val="tr-TR"/>
+        </w:rPr>
+        <w:t>no</w:t>
+      </w:r>
+      <w:proofErr w:type="spellEnd"/>
+      <w:r>
+        <w:rPr>
+          <w:lang w:val="tr-TR"/>
+        </w:rPr>
+        <w:t xml:space="preserve">, ad </w:t>
+      </w:r>
+      <w:proofErr w:type="spellStart"/>
+      <w:r>
+        <w:rPr>
+          <w:lang w:val="tr-TR"/>
+        </w:rPr>
+        <w:t>soyad</w:t>
+      </w:r>
+      <w:proofErr w:type="spellEnd"/>
+      <w:r>
+        <w:rPr>
+          <w:lang w:val="tr-TR"/>
+        </w:rPr>
+        <w:t>, firma, telefon, nitelik ve durum görünür.</w:t>
+      </w:r>
+    </w:p>
+    <w:p>
+      <w:pPr>
+        <w:pStyle w:val="ListeMaddemi"/>
+        <w:rPr>
+          <w:lang w:val="tr-TR"/>
+        </w:rPr>
+      </w:pPr>
+      <w:r>
+        <w:rPr>
+          <w:lang w:val="tr-TR"/>
+        </w:rPr>
+        <w:t xml:space="preserve">Ekran açıldığında liste boş gelir; arama kutusuna kimlik </w:t>
+      </w:r>
+      <w:proofErr w:type="spellStart"/>
+      <w:r>
+        <w:rPr>
+          <w:lang w:val="tr-TR"/>
+        </w:rPr>
+        <w:t>no</w:t>
+      </w:r>
+      <w:proofErr w:type="spellEnd"/>
+      <w:r>
+        <w:rPr>
+          <w:lang w:val="tr-TR"/>
+        </w:rPr>
+        <w:t xml:space="preserve">, ad </w:t>
+      </w:r>
+      <w:proofErr w:type="spellStart"/>
+      <w:r>
+        <w:rPr>
+          <w:lang w:val="tr-TR"/>
+        </w:rPr>
+        <w:t>soyad</w:t>
+      </w:r>
+      <w:proofErr w:type="spellEnd"/>
+      <w:r>
+        <w:rPr>
+          <w:lang w:val="tr-TR"/>
+        </w:rPr>
+        <w:t>, firma veya telefon yazınca eşleşen ilk 50 kayıt listelenir.</w:t>
+      </w:r>
+    </w:p>
+    <w:p>
+      <w:pPr>
+        <w:pStyle w:val="ListeMaddemi"/>
+        <w:rPr>
+          <w:lang w:val="tr-TR"/>
+        </w:rPr>
+      </w:pPr>
+      <w:r>
+        <w:rPr>
+          <w:lang w:val="tr-TR"/>
+        </w:rPr>
+        <w:t>Tüm kişileri listelemek veya filtrelemek için Kişiler Raporu kullanılır (bkz. 12. Raporlar).</w:t>
+      </w:r>
+    </w:p>
+    <w:p>
+      <w:pPr>
+        <w:pStyle w:val="ListeMaddemi"/>
+        <w:rPr>
+          <w:lang w:val="tr-TR"/>
+        </w:rPr>
+      </w:pPr>
+      <w:r>
+        <w:rPr>
+          <w:lang w:val="tr-TR"/>
+        </w:rPr>
+        <w:t>Sütun başlıklarına tıklayarak listeyi sıralayabilirsiniz, tekrar tıklamak sırayı ters çevirir.</w:t>
+      </w:r>
+    </w:p>
+    <w:p>
+      <w:pPr>
+        <w:pStyle w:val="ListeMaddemi"/>
+        <w:rPr>
+          <w:lang w:val="tr-TR"/>
+        </w:rPr>
+      </w:pPr>
+      <w:r>
+        <w:rPr>
+          <w:lang w:val="tr-TR"/>
+        </w:rPr>
+        <w:t>“+ Yeni Kişi” butonuyla yeni kayıt formu açılır.</w:t>
+      </w:r>
+    </w:p>
+    <w:p>
+      <w:pPr>
+        <w:pStyle w:val="ListeMaddemi"/>
+        <w:rPr>
+          <w:lang w:val="tr-TR"/>
+        </w:rPr>
+      </w:pPr>
+      <w:r>
+        <w:rPr>
+          <w:lang w:val="tr-TR"/>
+        </w:rPr>
+        <w:t>Kimlik numarası yazarken sistem otomatik olarak mevcut kayıtları arar.</w:t>
+      </w:r>
+    </w:p>
+    <w:p>
+      <w:pPr>
+        <w:pStyle w:val="ListeMaddemi"/>
+        <w:rPr>
+          <w:lang w:val="tr-TR"/>
+        </w:rPr>
+      </w:pPr>
+      <w:r>
+        <w:rPr>
+          <w:lang w:val="tr-TR"/>
+        </w:rPr>
+        <w:t>Eşleşen bir kayıt bulunursa listeden seçip doğrudan düzenleyebilirsiniz, tekrar kayıt oluşmaz.</w:t>
+      </w:r>
+    </w:p>
+    <w:p>
+      <w:pPr>
+        <w:pStyle w:val="ListeMaddemi"/>
+        <w:rPr>
+          <w:lang w:val="tr-TR"/>
+        </w:rPr>
+      </w:pPr>
+      <w:r>
+        <w:rPr>
+          <w:lang w:val="tr-TR"/>
+        </w:rPr>
+        <w:t xml:space="preserve">Ad </w:t>
+      </w:r>
+      <w:proofErr w:type="spellStart"/>
+      <w:r>
+        <w:rPr>
+          <w:lang w:val="tr-TR"/>
+        </w:rPr>
+        <w:t>soyad</w:t>
+      </w:r>
+      <w:proofErr w:type="spellEnd"/>
+      <w:r>
+        <w:rPr>
+          <w:lang w:val="tr-TR"/>
+        </w:rPr>
+        <w:t>, telefon ve firma adı bilgileri girilir.</w:t>
+      </w:r>
+    </w:p>
+    <w:p>
+      <w:pPr>
+        <w:pStyle w:val="ListeMaddemi"/>
+        <w:rPr>
+          <w:lang w:val="tr-TR"/>
+        </w:rPr>
+      </w:pPr>
+      <w:r>
+        <w:rPr>
+          <w:lang w:val="tr-TR"/>
+        </w:rPr>
+        <w:t>Firma adı yazarken önceden girilmiş firmalar önerilir.</w:t>
+      </w:r>
+    </w:p>
+    <w:p>
+      <w:pPr>
+        <w:pStyle w:val="ListeMaddemi"/>
+        <w:rPr>
+          <w:lang w:val="tr-TR"/>
+        </w:rPr>
+      </w:pPr>
+      <w:r>
+        <w:rPr>
+          <w:lang w:val="tr-TR"/>
+        </w:rPr>
+        <w:t>Aktif/Pasif durumu işaretlenir.</w:t>
+      </w:r>
+    </w:p>
+    <w:p>
+      <w:pPr>
+        <w:pStyle w:val="ListeMaddemi"/>
+        <w:rPr>
+          <w:lang w:val="tr-TR"/>
+        </w:rPr>
+      </w:pPr>
+      <w:r>
+        <w:rPr>
+          <w:lang w:val="tr-TR"/>
+        </w:rPr>
+        <w:t>Pasif kişiler için yasaklanma sebebi girilebilir.</w:t>
+      </w:r>
+    </w:p>
+    <w:p>
+      <w:pPr>
+        <w:pStyle w:val="ListeMaddemi"/>
+        <w:rPr>
+          <w:lang w:val="tr-TR"/>
+        </w:rPr>
+      </w:pPr>
+      <w:r>
+        <w:rPr>
+          <w:lang w:val="tr-TR"/>
+        </w:rPr>
+        <w:t>Ziyaretçi niteliği (Tekne Sahibi, Kaptan, Tekne Personeli) işaretlenir, birden fazlası seçilebilir.</w:t>
+      </w:r>
+    </w:p>
+    <w:p>
+      <w:pPr>
+        <w:pStyle w:val="ListeMaddemi"/>
+        <w:rPr>
+          <w:lang w:val="tr-TR"/>
+        </w:rPr>
+      </w:pPr>
+      <w:r>
+        <w:rPr>
+          <w:lang w:val="tr-TR"/>
+        </w:rPr>
+        <w:t>Belge tablosunda KVKK onayı ve tanımlı belgeler için “Alındı” işaretlenir.</w:t>
+      </w:r>
+    </w:p>
+    <w:p>
+      <w:pPr>
+        <w:pStyle w:val="ListeMaddemi"/>
+        <w:rPr>
+          <w:lang w:val="tr-TR"/>
+        </w:rPr>
+      </w:pPr>
+      <w:r>
+        <w:rPr>
+          <w:lang w:val="tr-TR"/>
+        </w:rPr>
+        <w:t>Geçerlilik tarihi gereken belgeler için tarih girilir.</w:t>
+      </w:r>
+    </w:p>
+    <w:p>
+      <w:pPr>
+        <w:pStyle w:val="ListeMaddemi"/>
+        <w:rPr>
+          <w:lang w:val="tr-TR"/>
+        </w:rPr>
+      </w:pPr>
+      <w:r>
+        <w:rPr>
+          <w:lang w:val="tr-TR"/>
+        </w:rPr>
+        <w:t>Süresi geçmiş belgeler kırmızı etiketle gösterilir.</w:t>
+      </w:r>
+    </w:p>
+    <w:p>
+      <w:pPr>
+        <w:pStyle w:val="ListeMaddemi"/>
+        <w:rPr>
+          <w:lang w:val="tr-TR"/>
+        </w:rPr>
+      </w:pPr>
+      <w:r>
+        <w:rPr>
+          <w:lang w:val="tr-TR"/>
+        </w:rPr>
+        <w:t>Kaydet butonuna basıldığında kişi bilgileri ve belgeler birlikte kaydedilir.</w:t>
+      </w:r>
+    </w:p>
+    <w:p>
+      <w:pPr>
+        <w:pStyle w:val="ListeMaddemi"/>
+        <w:rPr>
+          <w:lang w:val="tr-TR"/>
+        </w:rPr>
+      </w:pPr>
+      <w:r>
+        <w:rPr>
+          <w:lang w:val="tr-TR"/>
+        </w:rPr>
+        <w:t>Kayıttan sonra form temizlenir, yeni kayda hazır hale gelir.</w:t>
+      </w:r>
+    </w:p>
+    <w:p>
+      <w:pPr>
+        <w:pStyle w:val="ListeMaddemi"/>
+        <w:rPr>
+          <w:lang w:val="tr-TR"/>
+        </w:rPr>
+      </w:pPr>
+      <w:r>
+        <w:rPr>
+          <w:lang w:val="tr-TR"/>
+        </w:rPr>
+        <w:t>Düzenle butonuyla mevcut bir kişi güncellenebilir.</w:t>
+      </w:r>
+    </w:p>
+    <w:p>
+      <w:pPr>
+        <w:pStyle w:val="ListeMaddemi"/>
+        <w:rPr>
+          <w:lang w:val="tr-TR"/>
+        </w:rPr>
+      </w:pPr>
+      <w:r>
+        <w:rPr>
+          <w:lang w:val="tr-TR"/>
+        </w:rPr>
+        <w:t>Kapat butonuyla form kapatılır, listeye dönülür.</w:t>
+      </w:r>
     </w:p>
     <w:p>
       <w:pPr>
@@ -385,192 +823,10 @@
           <w:numId w:val="0"/>
         </w:numPr>
         <w:ind w:left="360"/>
-      </w:pPr>
-    </w:p>
-    <w:p>
-      <w:pPr>
-        <w:pStyle w:val="Balk1"/>
-      </w:pPr>
-      <w:r>
-        <w:lastRenderedPageBreak/>
-        <w:t>3. Kişiler</w:t>
-      </w:r>
-    </w:p>
-    <w:p>
-      <w:pPr>
-        <w:pStyle w:val="ListeMaddemi"/>
-      </w:pPr>
-      <w:r>
-        <w:t>Sahaya giren kişiler bu ekranda kayıt altına alınır.</w:t>
-      </w:r>
-    </w:p>
-    <w:p>
-      <w:pPr>
-        <w:pStyle w:val="ListeMaddemi"/>
-      </w:pPr>
-      <w:r>
-        <w:t>Listede kimlik no, ad soyad, firma, telefon, nitelik ve durum görünür.</w:t>
-      </w:r>
-    </w:p>
-    <w:p>
-      <w:pPr>
-        <w:pStyle w:val="ListeMaddemi"/>
-      </w:pPr>
-      <w:r>
-        <w:t>Arama kutusuna yazarak kişi bulabilirsiniz.</w:t>
-      </w:r>
-    </w:p>
-    <w:p>
-      <w:pPr>
-        <w:pStyle w:val="ListeMaddemi"/>
-      </w:pPr>
-      <w:r>
-        <w:t>Sütun başlıklarına tıklayarak listeyi sıralayabilirsiniz, tekrar tıklamak sırayı ters çevirir.</w:t>
-      </w:r>
-    </w:p>
-    <w:p>
-      <w:pPr>
-        <w:pStyle w:val="ListeMaddemi"/>
-      </w:pPr>
-      <w:r>
-        <w:t>“+ Yeni Kişi” butonuyla yeni kayıt formu açılır.</w:t>
-      </w:r>
-    </w:p>
-    <w:p>
-      <w:pPr>
-        <w:pStyle w:val="ListeMaddemi"/>
-      </w:pPr>
-      <w:r>
-        <w:t>Kimlik numarası yazarken sistem otomatik olarak mevcut kayıtları arar.</w:t>
-      </w:r>
-    </w:p>
-    <w:p>
-      <w:pPr>
-        <w:pStyle w:val="ListeMaddemi"/>
-      </w:pPr>
-      <w:r>
-        <w:t>Eşleşen bir kayıt bulunursa listeden seçip doğrudan düzenleyebilirsiniz, tekrar kayıt oluşmaz.</w:t>
-      </w:r>
-    </w:p>
-    <w:p>
-      <w:pPr>
-        <w:pStyle w:val="ListeMaddemi"/>
-      </w:pPr>
-      <w:r>
-        <w:t>Ad soyad, telefon ve firma adı bilgileri girilir.</w:t>
-      </w:r>
-    </w:p>
-    <w:p>
-      <w:pPr>
-        <w:pStyle w:val="ListeMaddemi"/>
-      </w:pPr>
-      <w:r>
-        <w:t>Firma adı yazarken önceden girilmiş firmalar önerilir.</w:t>
-      </w:r>
-    </w:p>
-    <w:p>
-      <w:pPr>
-        <w:pStyle w:val="ListeMaddemi"/>
-      </w:pPr>
-      <w:r>
-        <w:t>Aktif/Pasif durumu işaretlenir.</w:t>
-      </w:r>
-    </w:p>
-    <w:p>
-      <w:pPr>
-        <w:pStyle w:val="ListeMaddemi"/>
-      </w:pPr>
-      <w:r>
-        <w:t>Pasif kişiler için yasaklanma sebebi girilebilir.</w:t>
-      </w:r>
-    </w:p>
-    <w:p>
-      <w:pPr>
-        <w:pStyle w:val="ListeMaddemi"/>
-      </w:pPr>
-      <w:r>
-        <w:t>Ziyaretçi niteliği (Tekne Sahibi, Kaptan, Tekne Personeli) işaretlenir, birden fazlası seçilebilir.</w:t>
-      </w:r>
-    </w:p>
-    <w:p>
-      <w:pPr>
-        <w:pStyle w:val="ListeMaddemi"/>
-      </w:pPr>
-      <w:r>
-        <w:t>Belge tablosunda KVKK onayı ve tanımlı belgeler için “Alındı” işaretlenir.</w:t>
-      </w:r>
-    </w:p>
-    <w:p>
-      <w:pPr>
-        <w:pStyle w:val="ListeMaddemi"/>
-      </w:pPr>
-      <w:r>
-        <w:t>Geçerlilik tarihi gereken belgeler için tarih girilir.</w:t>
-      </w:r>
-    </w:p>
-    <w:p>
-      <w:pPr>
-        <w:pStyle w:val="ListeMaddemi"/>
-      </w:pPr>
-      <w:r>
-        <w:t>Süresi geçmiş belgeler kırmızı etiketle gösterilir.</w:t>
-      </w:r>
-    </w:p>
-    <w:p>
-      <w:pPr>
-        <w:pStyle w:val="ListeMaddemi"/>
-      </w:pPr>
-      <w:r>
-        <w:t>Kaydet butonuna basıldığında kişi bilgileri ve belgeler birlikte kaydedilir.</w:t>
-      </w:r>
-    </w:p>
-    <w:p>
-      <w:pPr>
-        <w:pStyle w:val="ListeMaddemi"/>
-      </w:pPr>
-      <w:r>
-        <w:t>Kayıttan sonra form temizlenir, yeni kayda hazır hale gelir.</w:t>
-      </w:r>
-    </w:p>
-    <w:p>
-      <w:pPr>
-        <w:pStyle w:val="ListeMaddemi"/>
-      </w:pPr>
-      <w:r>
-        <w:t>Düzenle butonuyla mevcut bir kişi güncellenebilir.</w:t>
-      </w:r>
-    </w:p>
-    <w:p>
-      <w:pPr>
-        <w:pStyle w:val="ListeMaddemi"/>
-      </w:pPr>
-      <w:r>
-        <w:t xml:space="preserve">Kapat butonuyla form </w:t>
-      </w:r>
-      <w:proofErr w:type="spellStart"/>
-      <w:r>
-        <w:t>kapatılır</w:t>
-      </w:r>
-      <w:proofErr w:type="spellEnd"/>
-      <w:r>
-        <w:t xml:space="preserve">, </w:t>
-      </w:r>
-      <w:proofErr w:type="spellStart"/>
-      <w:r>
-        <w:t>listeye</w:t>
-      </w:r>
-      <w:proofErr w:type="spellEnd"/>
-      <w:r>
-        <w:t xml:space="preserve"> </w:t>
-      </w:r>
-      <w:proofErr w:type="spellStart"/>
-      <w:r>
-        <w:t>dönülür</w:t>
-      </w:r>
-      <w:proofErr w:type="spellEnd"/>
-      <w:r>
-        <w:t>.</w:t>
-      </w:r>
+        <w:rPr>
+          <w:lang w:val="tr-TR"/>
+        </w:rPr>
+      </w:pPr>
     </w:p>
     <w:p>
       <w:pPr>
@@ -580,25 +836,20 @@
           <w:numId w:val="0"/>
         </w:numPr>
         <w:ind w:left="360"/>
-      </w:pPr>
-    </w:p>
-    <w:p>
-      <w:pPr>
-        <w:pStyle w:val="ListeMaddemi"/>
-        <w:numPr>
-          <w:ilvl w:val="0"/>
-          <w:numId w:val="0"/>
-        </w:numPr>
-        <w:ind w:left="360"/>
+        <w:jc w:val="center"/>
+        <w:rPr>
+          <w:lang w:val="tr-TR"/>
+        </w:rPr>
       </w:pPr>
       <w:r>
         <w:rPr>
           <w:noProof/>
+          <w:lang w:val="tr-TR"/>
         </w:rPr>
         <w:drawing>
-          <wp:inline distT="0" distB="0" distL="0" distR="0" wp14:anchorId="25595FA6" wp14:editId="10F59DD0">
-            <wp:extent cx="5486400" cy="2235835"/>
-            <wp:effectExtent l="0" t="0" r="0" b="0"/>
+          <wp:inline distT="0" distB="0" distL="0" distR="0" wp14:anchorId="25595FA6" wp14:editId="550BE8DF">
+            <wp:extent cx="4466428" cy="1820173"/>
+            <wp:effectExtent l="0" t="0" r="0" b="8890"/>
             <wp:docPr id="776646362" name="Resim 1"/>
             <wp:cNvGraphicFramePr>
               <a:graphicFrameLocks xmlns:a="http://schemas.openxmlformats.org/drawingml/2006/main" noChangeAspect="1"/>
@@ -619,7 +870,7 @@
                   <pic:spPr>
                     <a:xfrm>
                       <a:off x="0" y="0"/>
-                      <a:ext cx="5486400" cy="2235835"/>
+                      <a:ext cx="4473668" cy="1823123"/>
                     </a:xfrm>
                     <a:prstGeom prst="rect">
                       <a:avLst/>
@@ -646,127 +897,18 @@
           <w:iCs/>
           <w:sz w:val="18"/>
           <w:szCs w:val="18"/>
-        </w:rPr>
-      </w:pPr>
-      <w:proofErr w:type="spellStart"/>
+          <w:lang w:val="tr-TR"/>
+        </w:rPr>
+      </w:pPr>
       <w:r>
         <w:rPr>
           <w:i/>
           <w:iCs/>
           <w:sz w:val="18"/>
           <w:szCs w:val="18"/>
-        </w:rPr>
-        <w:t>Örnekte</w:t>
-      </w:r>
-      <w:proofErr w:type="spellEnd"/>
-      <w:r>
-        <w:rPr>
-          <w:i/>
-          <w:iCs/>
-          <w:sz w:val="18"/>
-          <w:szCs w:val="18"/>
-        </w:rPr>
-        <w:t xml:space="preserve"> </w:t>
-      </w:r>
-      <w:proofErr w:type="spellStart"/>
-      <w:r>
-        <w:rPr>
-          <w:i/>
-          <w:iCs/>
-          <w:sz w:val="18"/>
-          <w:szCs w:val="18"/>
-        </w:rPr>
-        <w:t>arama</w:t>
-      </w:r>
-      <w:proofErr w:type="spellEnd"/>
-      <w:r>
-        <w:rPr>
-          <w:i/>
-          <w:iCs/>
-          <w:sz w:val="18"/>
-          <w:szCs w:val="18"/>
-        </w:rPr>
-        <w:t xml:space="preserve"> </w:t>
-      </w:r>
-      <w:proofErr w:type="spellStart"/>
-      <w:r>
-        <w:rPr>
-          <w:i/>
-          <w:iCs/>
-          <w:sz w:val="18"/>
-          <w:szCs w:val="18"/>
-        </w:rPr>
-        <w:t>kutusunda</w:t>
-      </w:r>
-      <w:proofErr w:type="spellEnd"/>
-      <w:r>
-        <w:rPr>
-          <w:i/>
-          <w:iCs/>
-          <w:sz w:val="18"/>
-          <w:szCs w:val="18"/>
-        </w:rPr>
-        <w:t xml:space="preserve"> “KE” </w:t>
-      </w:r>
-      <w:proofErr w:type="spellStart"/>
-      <w:r>
-        <w:rPr>
-          <w:i/>
-          <w:iCs/>
-          <w:sz w:val="18"/>
-          <w:szCs w:val="18"/>
-        </w:rPr>
-        <w:t>ifadesi</w:t>
-      </w:r>
-      <w:proofErr w:type="spellEnd"/>
-      <w:r>
-        <w:rPr>
-          <w:i/>
-          <w:iCs/>
-          <w:sz w:val="18"/>
-          <w:szCs w:val="18"/>
-        </w:rPr>
-        <w:t xml:space="preserve"> </w:t>
-      </w:r>
-      <w:proofErr w:type="spellStart"/>
-      <w:r>
-        <w:rPr>
-          <w:i/>
-          <w:iCs/>
-          <w:sz w:val="18"/>
-          <w:szCs w:val="18"/>
-        </w:rPr>
-        <w:t>geçenler</w:t>
-      </w:r>
-      <w:proofErr w:type="spellEnd"/>
-      <w:r>
-        <w:rPr>
-          <w:i/>
-          <w:iCs/>
-          <w:sz w:val="18"/>
-          <w:szCs w:val="18"/>
-        </w:rPr>
-        <w:t xml:space="preserve"> </w:t>
-      </w:r>
-      <w:proofErr w:type="spellStart"/>
-      <w:r>
-        <w:rPr>
-          <w:i/>
-          <w:iCs/>
-          <w:sz w:val="18"/>
-          <w:szCs w:val="18"/>
-        </w:rPr>
-        <w:t>listelenmiştir</w:t>
-      </w:r>
-      <w:proofErr w:type="spellEnd"/>
-      <w:r>
-        <w:rPr>
-          <w:i/>
-          <w:iCs/>
-          <w:sz w:val="18"/>
-          <w:szCs w:val="18"/>
-        </w:rPr>
-        <w:t>.</w:t>
+          <w:lang w:val="tr-TR"/>
+        </w:rPr>
+        <w:t>Örnekte arama kutusunda “KE” ifadesi geçenler listelenmiştir.</w:t>
       </w:r>
     </w:p>
     <w:p>
@@ -783,6 +925,7 @@
           <w:iCs/>
           <w:sz w:val="18"/>
           <w:szCs w:val="18"/>
+          <w:lang w:val="tr-TR"/>
         </w:rPr>
       </w:pPr>
     </w:p>
@@ -800,17 +943,19 @@
           <w:iCs/>
           <w:sz w:val="18"/>
           <w:szCs w:val="18"/>
+          <w:lang w:val="tr-TR"/>
         </w:rPr>
       </w:pPr>
       <w:r>
         <w:rPr>
           <w:noProof/>
+          <w:lang w:val="tr-TR"/>
         </w:rPr>
         <w:lastRenderedPageBreak/>
         <w:drawing>
-          <wp:inline distT="0" distB="0" distL="0" distR="0" wp14:anchorId="708DA77F" wp14:editId="668E38C2">
-            <wp:extent cx="3490622" cy="2911930"/>
-            <wp:effectExtent l="0" t="0" r="0" b="3175"/>
+          <wp:inline distT="0" distB="0" distL="0" distR="0" wp14:anchorId="708DA77F" wp14:editId="46DD3F35">
+            <wp:extent cx="3391768" cy="2829464"/>
+            <wp:effectExtent l="0" t="0" r="0" b="9525"/>
             <wp:docPr id="1371204718" name="Resim 1"/>
             <wp:cNvGraphicFramePr>
               <a:graphicFrameLocks xmlns:a="http://schemas.openxmlformats.org/drawingml/2006/main" noChangeAspect="1"/>
@@ -831,7 +976,7 @@
                   <pic:spPr>
                     <a:xfrm>
                       <a:off x="0" y="0"/>
-                      <a:ext cx="3501125" cy="2920691"/>
+                      <a:ext cx="3405805" cy="2841174"/>
                     </a:xfrm>
                     <a:prstGeom prst="rect">
                       <a:avLst/>
@@ -858,268 +1003,39 @@
           <w:iCs/>
           <w:sz w:val="18"/>
           <w:szCs w:val="18"/>
-        </w:rPr>
-      </w:pPr>
-      <w:proofErr w:type="spellStart"/>
+          <w:lang w:val="tr-TR"/>
+        </w:rPr>
+      </w:pPr>
       <w:r>
         <w:rPr>
           <w:i/>
           <w:iCs/>
           <w:sz w:val="18"/>
           <w:szCs w:val="18"/>
-        </w:rPr>
-        <w:t>Örnekte</w:t>
-      </w:r>
-      <w:proofErr w:type="spellEnd"/>
+          <w:lang w:val="tr-TR"/>
+        </w:rPr>
+        <w:t xml:space="preserve">Örnekte Yeni </w:t>
+      </w:r>
       <w:r>
         <w:rPr>
           <w:i/>
           <w:iCs/>
           <w:sz w:val="18"/>
           <w:szCs w:val="18"/>
-        </w:rPr>
-        <w:t xml:space="preserve"> Yeni </w:t>
-      </w:r>
-      <w:proofErr w:type="spellStart"/>
+          <w:lang w:val="tr-TR"/>
+        </w:rPr>
+        <w:t>K</w:t>
+      </w:r>
       <w:r>
         <w:rPr>
           <w:i/>
           <w:iCs/>
           <w:sz w:val="18"/>
           <w:szCs w:val="18"/>
-        </w:rPr>
-        <w:t>K</w:t>
-      </w:r>
-      <w:r>
-        <w:rPr>
-          <w:i/>
-          <w:iCs/>
-          <w:sz w:val="18"/>
-          <w:szCs w:val="18"/>
-        </w:rPr>
-        <w:t>ayıt</w:t>
-      </w:r>
-      <w:proofErr w:type="spellEnd"/>
-      <w:r>
-        <w:rPr>
-          <w:i/>
-          <w:iCs/>
-          <w:sz w:val="18"/>
-          <w:szCs w:val="18"/>
-        </w:rPr>
-        <w:t xml:space="preserve"> </w:t>
-      </w:r>
-      <w:proofErr w:type="spellStart"/>
-      <w:r>
-        <w:rPr>
-          <w:i/>
-          <w:iCs/>
-          <w:sz w:val="18"/>
-          <w:szCs w:val="18"/>
-        </w:rPr>
-        <w:t>ekranında</w:t>
-      </w:r>
-      <w:proofErr w:type="spellEnd"/>
-      <w:r>
-        <w:rPr>
-          <w:i/>
-          <w:iCs/>
-          <w:sz w:val="18"/>
-          <w:szCs w:val="18"/>
-        </w:rPr>
-        <w:t xml:space="preserve"> </w:t>
-      </w:r>
-      <w:proofErr w:type="spellStart"/>
-      <w:r>
-        <w:rPr>
-          <w:i/>
-          <w:iCs/>
-          <w:sz w:val="18"/>
-          <w:szCs w:val="18"/>
-        </w:rPr>
-        <w:t>kimlik</w:t>
-      </w:r>
-      <w:proofErr w:type="spellEnd"/>
-      <w:r>
-        <w:rPr>
-          <w:i/>
-          <w:iCs/>
-          <w:sz w:val="18"/>
-          <w:szCs w:val="18"/>
-        </w:rPr>
-        <w:t xml:space="preserve"> </w:t>
-      </w:r>
-      <w:proofErr w:type="spellStart"/>
-      <w:r>
-        <w:rPr>
-          <w:i/>
-          <w:iCs/>
-          <w:sz w:val="18"/>
-          <w:szCs w:val="18"/>
-        </w:rPr>
-        <w:t>numarası</w:t>
-      </w:r>
-      <w:proofErr w:type="spellEnd"/>
-      <w:r>
-        <w:rPr>
-          <w:i/>
-          <w:iCs/>
-          <w:sz w:val="18"/>
-          <w:szCs w:val="18"/>
-        </w:rPr>
-        <w:t xml:space="preserve"> </w:t>
-      </w:r>
-      <w:proofErr w:type="spellStart"/>
-      <w:r>
-        <w:rPr>
-          <w:i/>
-          <w:iCs/>
-          <w:sz w:val="18"/>
-          <w:szCs w:val="18"/>
-        </w:rPr>
-        <w:t>yazarken</w:t>
-      </w:r>
-      <w:proofErr w:type="spellEnd"/>
-      <w:r>
-        <w:rPr>
-          <w:i/>
-          <w:iCs/>
-          <w:sz w:val="18"/>
-          <w:szCs w:val="18"/>
-        </w:rPr>
-        <w:t xml:space="preserve"> var </w:t>
-      </w:r>
-      <w:proofErr w:type="spellStart"/>
-      <w:r>
-        <w:rPr>
-          <w:i/>
-          <w:iCs/>
-          <w:sz w:val="18"/>
-          <w:szCs w:val="18"/>
-        </w:rPr>
-        <w:t>olan</w:t>
-      </w:r>
-      <w:proofErr w:type="spellEnd"/>
-      <w:r>
-        <w:rPr>
-          <w:i/>
-          <w:iCs/>
-          <w:sz w:val="18"/>
-          <w:szCs w:val="18"/>
-        </w:rPr>
-        <w:t xml:space="preserve"> </w:t>
-      </w:r>
-      <w:proofErr w:type="spellStart"/>
-      <w:r>
-        <w:rPr>
-          <w:i/>
-          <w:iCs/>
-          <w:sz w:val="18"/>
-          <w:szCs w:val="18"/>
-        </w:rPr>
-        <w:t>kayıtlar</w:t>
-      </w:r>
-      <w:proofErr w:type="spellEnd"/>
-      <w:r>
-        <w:rPr>
-          <w:i/>
-          <w:iCs/>
-          <w:sz w:val="18"/>
-          <w:szCs w:val="18"/>
-        </w:rPr>
-        <w:t xml:space="preserve"> </w:t>
-      </w:r>
-      <w:proofErr w:type="spellStart"/>
-      <w:r>
-        <w:rPr>
-          <w:i/>
-          <w:iCs/>
-          <w:sz w:val="18"/>
-          <w:szCs w:val="18"/>
-        </w:rPr>
-        <w:t>listelenir</w:t>
-      </w:r>
-      <w:proofErr w:type="spellEnd"/>
-      <w:r>
-        <w:rPr>
-          <w:i/>
-          <w:iCs/>
-          <w:sz w:val="18"/>
-          <w:szCs w:val="18"/>
-        </w:rPr>
-        <w:t xml:space="preserve"> </w:t>
-      </w:r>
-      <w:proofErr w:type="spellStart"/>
-      <w:r>
-        <w:rPr>
-          <w:i/>
-          <w:iCs/>
-          <w:sz w:val="18"/>
-          <w:szCs w:val="18"/>
-        </w:rPr>
-        <w:t>seçilerek</w:t>
-      </w:r>
-      <w:proofErr w:type="spellEnd"/>
-      <w:r>
-        <w:rPr>
-          <w:i/>
-          <w:iCs/>
-          <w:sz w:val="18"/>
-          <w:szCs w:val="18"/>
-        </w:rPr>
-        <w:t xml:space="preserve"> </w:t>
-      </w:r>
-      <w:proofErr w:type="spellStart"/>
-      <w:r>
-        <w:rPr>
-          <w:i/>
-          <w:iCs/>
-          <w:sz w:val="18"/>
-          <w:szCs w:val="18"/>
-        </w:rPr>
-        <w:t>kayda</w:t>
-      </w:r>
-      <w:proofErr w:type="spellEnd"/>
-      <w:r>
-        <w:rPr>
-          <w:i/>
-          <w:iCs/>
-          <w:sz w:val="18"/>
-          <w:szCs w:val="18"/>
-        </w:rPr>
-        <w:t xml:space="preserve"> </w:t>
-      </w:r>
-      <w:proofErr w:type="spellStart"/>
-      <w:r>
-        <w:rPr>
-          <w:i/>
-          <w:iCs/>
-          <w:sz w:val="18"/>
-          <w:szCs w:val="18"/>
-        </w:rPr>
-        <w:t>gidilmesi</w:t>
-      </w:r>
-      <w:proofErr w:type="spellEnd"/>
-      <w:r>
-        <w:rPr>
-          <w:i/>
-          <w:iCs/>
-          <w:sz w:val="18"/>
-          <w:szCs w:val="18"/>
-        </w:rPr>
-        <w:t xml:space="preserve"> </w:t>
-      </w:r>
-      <w:proofErr w:type="spellStart"/>
-      <w:r>
-        <w:rPr>
-          <w:i/>
-          <w:iCs/>
-          <w:sz w:val="18"/>
-          <w:szCs w:val="18"/>
-        </w:rPr>
-        <w:t>sağlanır</w:t>
-      </w:r>
-      <w:proofErr w:type="spellEnd"/>
+          <w:lang w:val="tr-TR"/>
+        </w:rPr>
+        <w:t>ayıt ekranında kimlik numarası yazarken var olan kayıtlar listelenir seçilerek kayda gidilmesi sağlanır</w:t>
+      </w:r>
     </w:p>
     <w:p>
       <w:pPr>
@@ -1135,14 +1051,17 @@
           <w:iCs/>
           <w:sz w:val="18"/>
           <w:szCs w:val="18"/>
+          <w:lang w:val="tr-TR"/>
         </w:rPr>
       </w:pPr>
       <w:r>
         <w:rPr>
           <w:i/>
           <w:iCs/>
+          <w:noProof/>
           <w:sz w:val="18"/>
           <w:szCs w:val="18"/>
+          <w:lang w:val="tr-TR"/>
         </w:rPr>
         <w:drawing>
           <wp:inline distT="0" distB="0" distL="0" distR="0" wp14:anchorId="520B634B" wp14:editId="0900D6AC">
@@ -1195,268 +1114,9 @@
           <w:iCs/>
           <w:sz w:val="18"/>
           <w:szCs w:val="18"/>
-        </w:rPr>
-      </w:pPr>
-      <w:proofErr w:type="spellStart"/>
-      <w:r>
-        <w:rPr>
-          <w:i/>
-          <w:iCs/>
-          <w:sz w:val="18"/>
-          <w:szCs w:val="18"/>
-        </w:rPr>
-        <w:t>Örnekte</w:t>
-      </w:r>
-      <w:proofErr w:type="spellEnd"/>
-      <w:r>
-        <w:rPr>
-          <w:i/>
-          <w:iCs/>
-          <w:sz w:val="18"/>
-          <w:szCs w:val="18"/>
-        </w:rPr>
-        <w:t xml:space="preserve"> </w:t>
-      </w:r>
-      <w:proofErr w:type="spellStart"/>
-      <w:r>
-        <w:rPr>
-          <w:i/>
-          <w:iCs/>
-          <w:sz w:val="18"/>
-          <w:szCs w:val="18"/>
-        </w:rPr>
-        <w:t>Firma</w:t>
-      </w:r>
-      <w:proofErr w:type="spellEnd"/>
-      <w:r>
-        <w:rPr>
-          <w:i/>
-          <w:iCs/>
-          <w:sz w:val="18"/>
-          <w:szCs w:val="18"/>
-        </w:rPr>
-        <w:t xml:space="preserve"> </w:t>
-      </w:r>
-      <w:proofErr w:type="spellStart"/>
-      <w:r>
-        <w:rPr>
-          <w:i/>
-          <w:iCs/>
-          <w:sz w:val="18"/>
-          <w:szCs w:val="18"/>
-        </w:rPr>
-        <w:t>Adı</w:t>
-      </w:r>
-      <w:proofErr w:type="spellEnd"/>
-      <w:r>
-        <w:rPr>
-          <w:i/>
-          <w:iCs/>
-          <w:sz w:val="18"/>
-          <w:szCs w:val="18"/>
-        </w:rPr>
-        <w:t xml:space="preserve"> </w:t>
-      </w:r>
-      <w:proofErr w:type="spellStart"/>
-      <w:r>
-        <w:rPr>
-          <w:i/>
-          <w:iCs/>
-          <w:sz w:val="18"/>
-          <w:szCs w:val="18"/>
-        </w:rPr>
-        <w:t>girişinde</w:t>
-      </w:r>
-      <w:proofErr w:type="spellEnd"/>
-      <w:r>
-        <w:rPr>
-          <w:i/>
-          <w:iCs/>
-          <w:sz w:val="18"/>
-          <w:szCs w:val="18"/>
-        </w:rPr>
-        <w:t xml:space="preserve"> var </w:t>
-      </w:r>
-      <w:proofErr w:type="spellStart"/>
-      <w:r>
-        <w:rPr>
-          <w:i/>
-          <w:iCs/>
-          <w:sz w:val="18"/>
-          <w:szCs w:val="18"/>
-        </w:rPr>
-        <w:t>olan</w:t>
-      </w:r>
-      <w:proofErr w:type="spellEnd"/>
-      <w:r>
-        <w:rPr>
-          <w:i/>
-          <w:iCs/>
-          <w:sz w:val="18"/>
-          <w:szCs w:val="18"/>
-        </w:rPr>
-        <w:t xml:space="preserve"> </w:t>
-      </w:r>
-      <w:proofErr w:type="spellStart"/>
-      <w:r>
-        <w:rPr>
-          <w:i/>
-          <w:iCs/>
-          <w:sz w:val="18"/>
-          <w:szCs w:val="18"/>
-        </w:rPr>
-        <w:t>firmalardan</w:t>
-      </w:r>
-      <w:proofErr w:type="spellEnd"/>
-      <w:r>
-        <w:rPr>
-          <w:i/>
-          <w:iCs/>
-          <w:sz w:val="18"/>
-          <w:szCs w:val="18"/>
-        </w:rPr>
-        <w:t xml:space="preserve"> </w:t>
-      </w:r>
-      <w:proofErr w:type="spellStart"/>
-      <w:r>
-        <w:rPr>
-          <w:i/>
-          <w:iCs/>
-          <w:sz w:val="18"/>
-          <w:szCs w:val="18"/>
-        </w:rPr>
-        <w:t>seçim</w:t>
-      </w:r>
-      <w:proofErr w:type="spellEnd"/>
-      <w:r>
-        <w:rPr>
-          <w:i/>
-          <w:iCs/>
-          <w:sz w:val="18"/>
-          <w:szCs w:val="18"/>
-        </w:rPr>
-        <w:t xml:space="preserve"> </w:t>
-      </w:r>
-      <w:proofErr w:type="spellStart"/>
-      <w:r>
-        <w:rPr>
-          <w:i/>
-          <w:iCs/>
-          <w:sz w:val="18"/>
-          <w:szCs w:val="18"/>
-        </w:rPr>
-        <w:t>yaparak</w:t>
-      </w:r>
-      <w:proofErr w:type="spellEnd"/>
-      <w:r>
-        <w:rPr>
-          <w:i/>
-          <w:iCs/>
-          <w:sz w:val="18"/>
-          <w:szCs w:val="18"/>
-        </w:rPr>
-        <w:t xml:space="preserve"> </w:t>
-      </w:r>
-      <w:proofErr w:type="spellStart"/>
-      <w:r>
-        <w:rPr>
-          <w:i/>
-          <w:iCs/>
-          <w:sz w:val="18"/>
-          <w:szCs w:val="18"/>
-        </w:rPr>
-        <w:t>firma</w:t>
-      </w:r>
-      <w:proofErr w:type="spellEnd"/>
-      <w:r>
-        <w:rPr>
-          <w:i/>
-          <w:iCs/>
-          <w:sz w:val="18"/>
-          <w:szCs w:val="18"/>
-        </w:rPr>
-        <w:t xml:space="preserve"> </w:t>
-      </w:r>
-      <w:proofErr w:type="spellStart"/>
-      <w:r>
-        <w:rPr>
-          <w:i/>
-          <w:iCs/>
-          <w:sz w:val="18"/>
-          <w:szCs w:val="18"/>
-        </w:rPr>
-        <w:t>adının</w:t>
-      </w:r>
-      <w:proofErr w:type="spellEnd"/>
-      <w:r>
-        <w:rPr>
-          <w:i/>
-          <w:iCs/>
-          <w:sz w:val="18"/>
-          <w:szCs w:val="18"/>
-        </w:rPr>
-        <w:t xml:space="preserve"> </w:t>
-      </w:r>
-      <w:proofErr w:type="spellStart"/>
-      <w:r>
-        <w:rPr>
-          <w:i/>
-          <w:iCs/>
-          <w:sz w:val="18"/>
-          <w:szCs w:val="18"/>
-        </w:rPr>
-        <w:t>mükerrer</w:t>
-      </w:r>
-      <w:proofErr w:type="spellEnd"/>
-      <w:r>
-        <w:rPr>
-          <w:i/>
-          <w:iCs/>
-          <w:sz w:val="18"/>
-          <w:szCs w:val="18"/>
-        </w:rPr>
-        <w:t xml:space="preserve"> </w:t>
-      </w:r>
-      <w:proofErr w:type="spellStart"/>
-      <w:r>
-        <w:rPr>
-          <w:i/>
-          <w:iCs/>
-          <w:sz w:val="18"/>
-          <w:szCs w:val="18"/>
-        </w:rPr>
-        <w:t>girişi</w:t>
-      </w:r>
-      <w:proofErr w:type="spellEnd"/>
-      <w:r>
-        <w:rPr>
-          <w:i/>
-          <w:iCs/>
-          <w:sz w:val="18"/>
-          <w:szCs w:val="18"/>
-        </w:rPr>
-        <w:t xml:space="preserve"> </w:t>
-      </w:r>
-      <w:proofErr w:type="spellStart"/>
-      <w:r>
-        <w:rPr>
-          <w:i/>
-          <w:iCs/>
-          <w:sz w:val="18"/>
-          <w:szCs w:val="18"/>
-        </w:rPr>
-        <w:t>engellenir</w:t>
-      </w:r>
-      <w:proofErr w:type="spellEnd"/>
-      <w:r>
-        <w:rPr>
-          <w:i/>
-          <w:iCs/>
-          <w:sz w:val="18"/>
-          <w:szCs w:val="18"/>
-        </w:rPr>
-        <w:t>.</w:t>
-      </w:r>
+          <w:lang w:val="tr-TR"/>
+        </w:rPr>
+      </w:pPr>
     </w:p>
     <w:p>
       <w:pPr>
@@ -1472,8 +1132,19 @@
           <w:iCs/>
           <w:sz w:val="18"/>
           <w:szCs w:val="18"/>
-        </w:rPr>
-      </w:pPr>
+          <w:lang w:val="tr-TR"/>
+        </w:rPr>
+      </w:pPr>
+      <w:r>
+        <w:rPr>
+          <w:i/>
+          <w:iCs/>
+          <w:sz w:val="18"/>
+          <w:szCs w:val="18"/>
+          <w:lang w:val="tr-TR"/>
+        </w:rPr>
+        <w:t>Örnekte Firma Adı girişinde var olan firmalardan seçim yaparak firma adının mükerrer girişi engellenir.</w:t>
+      </w:r>
     </w:p>
     <w:p>
       <w:pPr>
@@ -1489,6 +1160,7 @@
           <w:iCs/>
           <w:sz w:val="18"/>
           <w:szCs w:val="18"/>
+          <w:lang w:val="tr-TR"/>
         </w:rPr>
       </w:pPr>
     </w:p>
@@ -1506,6 +1178,7 @@
           <w:iCs/>
           <w:sz w:val="18"/>
           <w:szCs w:val="18"/>
+          <w:lang w:val="tr-TR"/>
         </w:rPr>
       </w:pPr>
     </w:p>
@@ -1523,6 +1196,7 @@
           <w:iCs/>
           <w:sz w:val="18"/>
           <w:szCs w:val="18"/>
+          <w:lang w:val="tr-TR"/>
         </w:rPr>
       </w:pPr>
     </w:p>
@@ -1540,6 +1214,7 @@
           <w:iCs/>
           <w:sz w:val="18"/>
           <w:szCs w:val="18"/>
+          <w:lang w:val="tr-TR"/>
         </w:rPr>
       </w:pPr>
     </w:p>
@@ -1557,6 +1232,7 @@
           <w:iCs/>
           <w:sz w:val="18"/>
           <w:szCs w:val="18"/>
+          <w:lang w:val="tr-TR"/>
         </w:rPr>
       </w:pPr>
     </w:p>
@@ -1574,6 +1250,7 @@
           <w:iCs/>
           <w:sz w:val="18"/>
           <w:szCs w:val="18"/>
+          <w:lang w:val="tr-TR"/>
         </w:rPr>
       </w:pPr>
     </w:p>
@@ -1591,106 +1268,8 @@
           <w:iCs/>
           <w:sz w:val="18"/>
           <w:szCs w:val="18"/>
-        </w:rPr>
-      </w:pPr>
-    </w:p>
-    <w:p>
-      <w:pPr>
-        <w:pStyle w:val="Balk1"/>
-      </w:pPr>
-      <w:r>
-        <w:lastRenderedPageBreak/>
-        <w:t>4. Araçlar</w:t>
-      </w:r>
-    </w:p>
-    <w:p>
-      <w:pPr>
-        <w:pStyle w:val="ListeMaddemi"/>
-      </w:pPr>
-      <w:r>
-        <w:t>Araçlar ekranı Kişiler ekranıyla aynı mantıkla çalışır.</w:t>
-      </w:r>
-    </w:p>
-    <w:p>
-      <w:pPr>
-        <w:pStyle w:val="ListeMaddemi"/>
-      </w:pPr>
-      <w:r>
-        <w:t>Takip numarası; plaka veya vinç, vidanjör gibi ekipmanların seri numarası olabilir.</w:t>
-      </w:r>
-    </w:p>
-    <w:p>
-      <w:pPr>
-        <w:pStyle w:val="ListeMaddemi"/>
-      </w:pPr>
-      <w:r>
-        <w:t>Araç Türü seçilir: Araç, Vinç, Vidanjör, Kompresör, Basınçlı Kap.</w:t>
-      </w:r>
-    </w:p>
-    <w:p>
-      <w:pPr>
-        <w:pStyle w:val="ListeMaddemi"/>
-      </w:pPr>
-      <w:r>
-        <w:t>Takip numarası yazarken mevcut kayıtlar aranır, eşleşme varsa seçilip düzenlenebilir.</w:t>
-      </w:r>
-    </w:p>
-    <w:p>
-      <w:pPr>
-        <w:pStyle w:val="ListeMaddemi"/>
-      </w:pPr>
-      <w:r>
-        <w:t>Belge tablosu, seçilen araç türüne göre otomatik filtrelenir.</w:t>
-      </w:r>
-    </w:p>
-    <w:p>
-      <w:pPr>
-        <w:pStyle w:val="ListeMaddemi"/>
-      </w:pPr>
-      <w:r>
-        <w:t>Firma adı, Aktif/Pasif, yasaklanma sebebi alanları Kişiler ile aynı şekilde çalışır.</w:t>
-      </w:r>
-    </w:p>
-    <w:p>
-      <w:pPr>
-        <w:pStyle w:val="ListeMaddemi"/>
-      </w:pPr>
-      <w:r>
-        <w:t xml:space="preserve">Kaydet sonrası form temizlenir, yeni </w:t>
-      </w:r>
-      <w:proofErr w:type="spellStart"/>
-      <w:r>
-        <w:t>kayda</w:t>
-      </w:r>
-      <w:proofErr w:type="spellEnd"/>
-      <w:r>
-        <w:t xml:space="preserve"> </w:t>
-      </w:r>
-      <w:proofErr w:type="spellStart"/>
-      <w:r>
-        <w:t>hazır</w:t>
-      </w:r>
-      <w:proofErr w:type="spellEnd"/>
-      <w:r>
-        <w:t xml:space="preserve"> hale </w:t>
-      </w:r>
-      <w:proofErr w:type="spellStart"/>
-      <w:r>
-        <w:t>gelir</w:t>
-      </w:r>
-      <w:proofErr w:type="spellEnd"/>
-      <w:r>
-        <w:t>.</w:t>
-      </w:r>
-    </w:p>
-    <w:p>
-      <w:pPr>
-        <w:pStyle w:val="ListeMaddemi"/>
-        <w:numPr>
-          <w:ilvl w:val="0"/>
-          <w:numId w:val="0"/>
-        </w:numPr>
-        <w:ind w:left="360"/>
+          <w:lang w:val="tr-TR"/>
+        </w:rPr>
       </w:pPr>
     </w:p>
     <w:p>
@@ -1702,10 +1281,186 @@
         </w:numPr>
         <w:ind w:left="360"/>
         <w:jc w:val="center"/>
+        <w:rPr>
+          <w:i/>
+          <w:iCs/>
+          <w:sz w:val="18"/>
+          <w:szCs w:val="18"/>
+          <w:lang w:val="tr-TR"/>
+        </w:rPr>
+      </w:pPr>
+    </w:p>
+    <w:p>
+      <w:pPr>
+        <w:pStyle w:val="Balk1"/>
+        <w:rPr>
+          <w:lang w:val="tr-TR"/>
+        </w:rPr>
+      </w:pPr>
+      <w:r>
+        <w:rPr>
+          <w:lang w:val="tr-TR"/>
+        </w:rPr>
+        <w:lastRenderedPageBreak/>
+        <w:t>4. Araçlar</w:t>
+      </w:r>
+    </w:p>
+    <w:p>
+      <w:pPr>
+        <w:pStyle w:val="ListeMaddemi"/>
+        <w:rPr>
+          <w:lang w:val="tr-TR"/>
+        </w:rPr>
+      </w:pPr>
+      <w:r>
+        <w:rPr>
+          <w:lang w:val="tr-TR"/>
+        </w:rPr>
+        <w:t>Araçlar ekranı Kişiler ekranıyla aynı mantıkla çalışır.</w:t>
+      </w:r>
+    </w:p>
+    <w:p>
+      <w:pPr>
+        <w:pStyle w:val="ListeMaddemi"/>
+        <w:rPr>
+          <w:lang w:val="tr-TR"/>
+        </w:rPr>
+      </w:pPr>
+      <w:r>
+        <w:rPr>
+          <w:lang w:val="tr-TR"/>
+        </w:rPr>
+        <w:t xml:space="preserve">Liste yalnızca arama yapıldığında gelir (takip </w:t>
+      </w:r>
+      <w:proofErr w:type="spellStart"/>
+      <w:r>
+        <w:rPr>
+          <w:lang w:val="tr-TR"/>
+        </w:rPr>
+        <w:t>no</w:t>
+      </w:r>
+      <w:proofErr w:type="spellEnd"/>
+      <w:r>
+        <w:rPr>
+          <w:lang w:val="tr-TR"/>
+        </w:rPr>
+        <w:t>, araç türü, firma); eşleşen ilk 50 kayıt gösterilir.</w:t>
+      </w:r>
+    </w:p>
+    <w:p>
+      <w:pPr>
+        <w:pStyle w:val="ListeMaddemi"/>
+        <w:rPr>
+          <w:lang w:val="tr-TR"/>
+        </w:rPr>
+      </w:pPr>
+      <w:r>
+        <w:rPr>
+          <w:lang w:val="tr-TR"/>
+        </w:rPr>
+        <w:t>Takip numarası; plaka veya vinç, vidanjör gibi ekipmanların seri numarası olabilir.</w:t>
+      </w:r>
+    </w:p>
+    <w:p>
+      <w:pPr>
+        <w:pStyle w:val="ListeMaddemi"/>
+        <w:rPr>
+          <w:lang w:val="tr-TR"/>
+        </w:rPr>
+      </w:pPr>
+      <w:r>
+        <w:rPr>
+          <w:lang w:val="tr-TR"/>
+        </w:rPr>
+        <w:t>Araç Türü seçilir: Araç, Vinç, Vidanjör, Kompresör, Basınçlı Kap.</w:t>
+      </w:r>
+    </w:p>
+    <w:p>
+      <w:pPr>
+        <w:pStyle w:val="ListeMaddemi"/>
+        <w:rPr>
+          <w:lang w:val="tr-TR"/>
+        </w:rPr>
+      </w:pPr>
+      <w:r>
+        <w:rPr>
+          <w:lang w:val="tr-TR"/>
+        </w:rPr>
+        <w:t>Takip numarası yazarken mevcut kayıtlar aranır, eşleşme varsa seçilip düzenlenebilir.</w:t>
+      </w:r>
+    </w:p>
+    <w:p>
+      <w:pPr>
+        <w:pStyle w:val="ListeMaddemi"/>
+        <w:rPr>
+          <w:lang w:val="tr-TR"/>
+        </w:rPr>
+      </w:pPr>
+      <w:r>
+        <w:rPr>
+          <w:lang w:val="tr-TR"/>
+        </w:rPr>
+        <w:t>Belge tablosu, seçilen araç türüne göre otomatik filtrelenir.</w:t>
+      </w:r>
+    </w:p>
+    <w:p>
+      <w:pPr>
+        <w:pStyle w:val="ListeMaddemi"/>
+        <w:rPr>
+          <w:lang w:val="tr-TR"/>
+        </w:rPr>
+      </w:pPr>
+      <w:r>
+        <w:rPr>
+          <w:lang w:val="tr-TR"/>
+        </w:rPr>
+        <w:t>Firma adı, Aktif/Pasif, yasaklanma sebebi alanları Kişiler ile aynı şekilde çalışır.</w:t>
+      </w:r>
+    </w:p>
+    <w:p>
+      <w:pPr>
+        <w:pStyle w:val="ListeMaddemi"/>
+        <w:rPr>
+          <w:lang w:val="tr-TR"/>
+        </w:rPr>
+      </w:pPr>
+      <w:r>
+        <w:rPr>
+          <w:lang w:val="tr-TR"/>
+        </w:rPr>
+        <w:t>Kaydet sonrası form temizlenir, yeni kayda hazır hale gelir.</w:t>
+      </w:r>
+    </w:p>
+    <w:p>
+      <w:pPr>
+        <w:pStyle w:val="ListeMaddemi"/>
+        <w:numPr>
+          <w:ilvl w:val="0"/>
+          <w:numId w:val="0"/>
+        </w:numPr>
+        <w:ind w:left="360"/>
+        <w:rPr>
+          <w:lang w:val="tr-TR"/>
+        </w:rPr>
+      </w:pPr>
+    </w:p>
+    <w:p>
+      <w:pPr>
+        <w:pStyle w:val="ListeMaddemi"/>
+        <w:numPr>
+          <w:ilvl w:val="0"/>
+          <w:numId w:val="0"/>
+        </w:numPr>
+        <w:ind w:left="360"/>
+        <w:jc w:val="center"/>
+        <w:rPr>
+          <w:lang w:val="tr-TR"/>
+        </w:rPr>
       </w:pPr>
       <w:r>
         <w:rPr>
           <w:noProof/>
+          <w:lang w:val="tr-TR"/>
         </w:rPr>
         <w:drawing>
           <wp:inline distT="0" distB="0" distL="0" distR="0" wp14:anchorId="4EDA0276" wp14:editId="363A2E16">
@@ -1753,189 +1508,103 @@
         </w:numPr>
         <w:ind w:left="360"/>
         <w:jc w:val="center"/>
-      </w:pPr>
-      <w:proofErr w:type="spellStart"/>
+        <w:rPr>
+          <w:lang w:val="tr-TR"/>
+        </w:rPr>
+      </w:pPr>
       <w:r>
         <w:rPr>
           <w:i/>
           <w:iCs/>
           <w:sz w:val="18"/>
           <w:szCs w:val="18"/>
-        </w:rPr>
-        <w:t>Araç</w:t>
-      </w:r>
-      <w:proofErr w:type="spellEnd"/>
-      <w:r>
-        <w:rPr>
-          <w:i/>
-          <w:iCs/>
-          <w:sz w:val="18"/>
-          <w:szCs w:val="18"/>
-        </w:rPr>
-        <w:t xml:space="preserve"> </w:t>
-      </w:r>
-      <w:proofErr w:type="spellStart"/>
-      <w:r>
-        <w:rPr>
-          <w:i/>
-          <w:iCs/>
-          <w:sz w:val="18"/>
-          <w:szCs w:val="18"/>
-        </w:rPr>
-        <w:t>türüne</w:t>
-      </w:r>
-      <w:proofErr w:type="spellEnd"/>
-      <w:r>
-        <w:rPr>
-          <w:i/>
-          <w:iCs/>
-          <w:sz w:val="18"/>
-          <w:szCs w:val="18"/>
-        </w:rPr>
-        <w:t xml:space="preserve"> </w:t>
-      </w:r>
-      <w:proofErr w:type="spellStart"/>
-      <w:r>
-        <w:rPr>
-          <w:i/>
-          <w:iCs/>
-          <w:sz w:val="18"/>
-          <w:szCs w:val="18"/>
-        </w:rPr>
-        <w:t>uygun</w:t>
-      </w:r>
-      <w:proofErr w:type="spellEnd"/>
-      <w:r>
-        <w:rPr>
-          <w:i/>
-          <w:iCs/>
-          <w:sz w:val="18"/>
-          <w:szCs w:val="18"/>
-        </w:rPr>
-        <w:t xml:space="preserve"> </w:t>
-      </w:r>
-      <w:proofErr w:type="spellStart"/>
-      <w:r>
-        <w:rPr>
-          <w:i/>
-          <w:iCs/>
-          <w:sz w:val="18"/>
-          <w:szCs w:val="18"/>
-        </w:rPr>
-        <w:t>olan</w:t>
-      </w:r>
-      <w:proofErr w:type="spellEnd"/>
-      <w:r>
-        <w:rPr>
-          <w:i/>
-          <w:iCs/>
-          <w:sz w:val="18"/>
-          <w:szCs w:val="18"/>
-        </w:rPr>
-        <w:t xml:space="preserve"> </w:t>
-      </w:r>
-      <w:proofErr w:type="spellStart"/>
-      <w:r>
-        <w:rPr>
-          <w:i/>
-          <w:iCs/>
-          <w:sz w:val="18"/>
-          <w:szCs w:val="18"/>
-        </w:rPr>
-        <w:t>belgeler</w:t>
-      </w:r>
-      <w:proofErr w:type="spellEnd"/>
-      <w:r>
-        <w:rPr>
-          <w:i/>
-          <w:iCs/>
-          <w:sz w:val="18"/>
-          <w:szCs w:val="18"/>
-        </w:rPr>
-        <w:t xml:space="preserve"> </w:t>
-      </w:r>
-      <w:proofErr w:type="spellStart"/>
-      <w:r>
-        <w:rPr>
-          <w:i/>
-          <w:iCs/>
-          <w:sz w:val="18"/>
-          <w:szCs w:val="18"/>
-        </w:rPr>
-        <w:t>listelenir</w:t>
-      </w:r>
-      <w:proofErr w:type="spellEnd"/>
+          <w:lang w:val="tr-TR"/>
+        </w:rPr>
+        <w:t>Araç türüne uygun olan belgeler listelenir</w:t>
+      </w:r>
     </w:p>
     <w:p>
       <w:pPr>
         <w:pStyle w:val="Balk1"/>
-      </w:pPr>
-      <w:r>
+        <w:rPr>
+          <w:lang w:val="tr-TR"/>
+        </w:rPr>
+      </w:pPr>
+      <w:r>
+        <w:rPr>
+          <w:lang w:val="tr-TR"/>
+        </w:rPr>
         <w:t>5. Tekneler</w:t>
       </w:r>
     </w:p>
     <w:p>
       <w:pPr>
         <w:pStyle w:val="ListeMaddemi"/>
-      </w:pPr>
-      <w:r>
+        <w:rPr>
+          <w:lang w:val="tr-TR"/>
+        </w:rPr>
+      </w:pPr>
+      <w:r>
+        <w:rPr>
+          <w:lang w:val="tr-TR"/>
+        </w:rPr>
         <w:t>Sahadaki tekneler bu ekranda tanımlanır.</w:t>
       </w:r>
     </w:p>
     <w:p>
       <w:pPr>
         <w:pStyle w:val="ListeMaddemi"/>
-      </w:pPr>
-      <w:r>
+        <w:rPr>
+          <w:lang w:val="tr-TR"/>
+        </w:rPr>
+      </w:pPr>
+      <w:r>
+        <w:rPr>
+          <w:lang w:val="tr-TR"/>
+        </w:rPr>
         <w:t>Tekne Kodu ve Tekne Adı girilir.</w:t>
       </w:r>
     </w:p>
     <w:p>
       <w:pPr>
         <w:pStyle w:val="ListeMaddemi"/>
-      </w:pPr>
-      <w:r>
+        <w:rPr>
+          <w:lang w:val="tr-TR"/>
+        </w:rPr>
+      </w:pPr>
+      <w:r>
+        <w:rPr>
+          <w:lang w:val="tr-TR"/>
+        </w:rPr>
         <w:t>Aktif/Pasif durumu işaretlenir.</w:t>
       </w:r>
     </w:p>
     <w:p>
       <w:pPr>
         <w:pStyle w:val="ListeMaddemi"/>
-      </w:pPr>
-      <w:r>
-        <w:t xml:space="preserve">Arama ve sıralama diğer </w:t>
-      </w:r>
-      <w:proofErr w:type="spellStart"/>
-      <w:r>
-        <w:t>listelerle</w:t>
-      </w:r>
-      <w:proofErr w:type="spellEnd"/>
-      <w:r>
-        <w:t xml:space="preserve"> </w:t>
-      </w:r>
-      <w:proofErr w:type="spellStart"/>
-      <w:r>
-        <w:t>aynı</w:t>
-      </w:r>
-      <w:proofErr w:type="spellEnd"/>
-      <w:r>
-        <w:t xml:space="preserve"> </w:t>
-      </w:r>
-      <w:proofErr w:type="spellStart"/>
-      <w:r>
-        <w:t>şekilde</w:t>
-      </w:r>
-      <w:proofErr w:type="spellEnd"/>
-      <w:r>
-        <w:t xml:space="preserve"> </w:t>
-      </w:r>
-      <w:proofErr w:type="spellStart"/>
-      <w:r>
-        <w:t>çalışır</w:t>
-      </w:r>
-      <w:proofErr w:type="spellEnd"/>
-      <w:r>
-        <w:t>.</w:t>
+        <w:rPr>
+          <w:lang w:val="tr-TR"/>
+        </w:rPr>
+      </w:pPr>
+      <w:r>
+        <w:rPr>
+          <w:lang w:val="tr-TR"/>
+        </w:rPr>
+        <w:t>Ekran açıldığında liste boş gelir; tekne kodu veya adı yazınca eşleşen ilk 50 kayıt listelenir.</w:t>
+      </w:r>
+    </w:p>
+    <w:p>
+      <w:pPr>
+        <w:pStyle w:val="ListeMaddemi"/>
+        <w:rPr>
+          <w:lang w:val="tr-TR"/>
+        </w:rPr>
+      </w:pPr>
+      <w:r>
+        <w:rPr>
+          <w:lang w:val="tr-TR"/>
+        </w:rPr>
+        <w:t>Tüm tekneleri görmek veya Aktif/Pasif durumuna göre filtrelemek için Tekneler Raporu kullanılır (bkz. 12. Raporlar).</w:t>
       </w:r>
     </w:p>
     <w:p>
@@ -1946,6 +1615,9 @@
           <w:numId w:val="0"/>
         </w:numPr>
         <w:ind w:left="360"/>
+        <w:rPr>
+          <w:lang w:val="tr-TR"/>
+        </w:rPr>
       </w:pPr>
     </w:p>
     <w:p>
@@ -1956,6 +1628,9 @@
           <w:numId w:val="0"/>
         </w:numPr>
         <w:ind w:left="360"/>
+        <w:rPr>
+          <w:lang w:val="tr-TR"/>
+        </w:rPr>
       </w:pPr>
     </w:p>
     <w:p>
@@ -1966,6 +1641,9 @@
           <w:numId w:val="0"/>
         </w:numPr>
         <w:ind w:left="360"/>
+        <w:rPr>
+          <w:lang w:val="tr-TR"/>
+        </w:rPr>
       </w:pPr>
     </w:p>
     <w:p>
@@ -1976,6 +1654,9 @@
           <w:numId w:val="0"/>
         </w:numPr>
         <w:ind w:left="360"/>
+        <w:rPr>
+          <w:lang w:val="tr-TR"/>
+        </w:rPr>
       </w:pPr>
     </w:p>
     <w:p>
@@ -1986,6 +1667,9 @@
           <w:numId w:val="0"/>
         </w:numPr>
         <w:ind w:left="360"/>
+        <w:rPr>
+          <w:lang w:val="tr-TR"/>
+        </w:rPr>
       </w:pPr>
     </w:p>
     <w:p>
@@ -1996,6 +1680,9 @@
           <w:numId w:val="0"/>
         </w:numPr>
         <w:ind w:left="360"/>
+        <w:rPr>
+          <w:lang w:val="tr-TR"/>
+        </w:rPr>
       </w:pPr>
     </w:p>
     <w:p>
@@ -2006,7 +1693,133 @@
           <w:numId w:val="0"/>
         </w:numPr>
         <w:ind w:left="360"/>
-      </w:pPr>
+        <w:rPr>
+          <w:lang w:val="tr-TR"/>
+        </w:rPr>
+      </w:pPr>
+    </w:p>
+    <w:p>
+      <w:pPr>
+        <w:pStyle w:val="Balk1"/>
+        <w:rPr>
+          <w:lang w:val="tr-TR"/>
+        </w:rPr>
+      </w:pPr>
+      <w:r>
+        <w:rPr>
+          <w:lang w:val="tr-TR"/>
+        </w:rPr>
+        <w:lastRenderedPageBreak/>
+        <w:t>6. Kişi Belgeleri (Kural Tanımı)</w:t>
+      </w:r>
+    </w:p>
+    <w:p>
+      <w:pPr>
+        <w:pStyle w:val="ListeMaddemi"/>
+        <w:rPr>
+          <w:lang w:val="tr-TR"/>
+        </w:rPr>
+      </w:pPr>
+      <w:r>
+        <w:rPr>
+          <w:lang w:val="tr-TR"/>
+        </w:rPr>
+        <w:t>Bu ekranda kişilerden hangi belgelerin isteneceği tanımlanır.</w:t>
+      </w:r>
+    </w:p>
+    <w:p>
+      <w:pPr>
+        <w:pStyle w:val="ListeMaddemi"/>
+        <w:rPr>
+          <w:lang w:val="tr-TR"/>
+        </w:rPr>
+      </w:pPr>
+      <w:r>
+        <w:rPr>
+          <w:lang w:val="tr-TR"/>
+        </w:rPr>
+        <w:t>Belge adı serbest metin olarak girilir.</w:t>
+      </w:r>
+    </w:p>
+    <w:p>
+      <w:pPr>
+        <w:pStyle w:val="ListeMaddemi"/>
+        <w:rPr>
+          <w:lang w:val="tr-TR"/>
+        </w:rPr>
+      </w:pPr>
+      <w:r>
+        <w:rPr>
+          <w:lang w:val="tr-TR"/>
+        </w:rPr>
+        <w:t>“Alındı” kontrolü ve gerekiyorsa “geçerlilik tarihi” kontrolü işaretlenir.</w:t>
+      </w:r>
+    </w:p>
+    <w:p>
+      <w:pPr>
+        <w:pStyle w:val="ListeMaddemi"/>
+        <w:rPr>
+          <w:lang w:val="tr-TR"/>
+        </w:rPr>
+      </w:pPr>
+      <w:r>
+        <w:rPr>
+          <w:lang w:val="tr-TR"/>
+        </w:rPr>
+        <w:t xml:space="preserve">Belgenin hangi </w:t>
+      </w:r>
+      <w:r>
+        <w:rPr>
+          <w:b/>
+          <w:bCs/>
+          <w:lang w:val="tr-TR"/>
+        </w:rPr>
+        <w:t>Z</w:t>
+      </w:r>
+      <w:r>
+        <w:rPr>
+          <w:b/>
+          <w:bCs/>
+          <w:lang w:val="tr-TR"/>
+        </w:rPr>
+        <w:t xml:space="preserve">iyaret </w:t>
+      </w:r>
+      <w:r>
+        <w:rPr>
+          <w:b/>
+          <w:bCs/>
+          <w:lang w:val="tr-TR"/>
+        </w:rPr>
+        <w:t>S</w:t>
+      </w:r>
+      <w:r>
+        <w:rPr>
+          <w:b/>
+          <w:bCs/>
+          <w:lang w:val="tr-TR"/>
+        </w:rPr>
+        <w:t>ebepleri</w:t>
+      </w:r>
+      <w:r>
+        <w:rPr>
+          <w:lang w:val="tr-TR"/>
+        </w:rPr>
+        <w:t xml:space="preserve"> için geçerli olduğu işaretlenir (Çalışma, Görüşme, Keşif, Kontrol, Malzeme Alma, Malzeme Bırakma, İskele Kurma).</w:t>
+      </w:r>
+    </w:p>
+    <w:p>
+      <w:pPr>
+        <w:pStyle w:val="ListeMaddemi"/>
+        <w:rPr>
+          <w:lang w:val="tr-TR"/>
+        </w:rPr>
+      </w:pPr>
+      <w:r>
+        <w:rPr>
+          <w:lang w:val="tr-TR"/>
+        </w:rPr>
+        <w:t>Aktif/Pasif durumu işaretlenir; pasif kurallar kişi formunda görünmez.</w:t>
+      </w:r>
     </w:p>
     <w:p>
       <w:pPr>
@@ -2016,194 +1829,9 @@
           <w:numId w:val="0"/>
         </w:numPr>
         <w:ind w:left="360"/>
-      </w:pPr>
-    </w:p>
-    <w:p>
-      <w:pPr>
-        <w:pStyle w:val="ListeMaddemi"/>
-        <w:numPr>
-          <w:ilvl w:val="0"/>
-          <w:numId w:val="0"/>
-        </w:numPr>
-        <w:ind w:left="360"/>
-      </w:pPr>
-    </w:p>
-    <w:p>
-      <w:pPr>
-        <w:pStyle w:val="Balk1"/>
-      </w:pPr>
-      <w:r>
-        <w:lastRenderedPageBreak/>
-        <w:t>6. Kişi Belgeleri (Kural Tanımı)</w:t>
-      </w:r>
-    </w:p>
-    <w:p>
-      <w:pPr>
-        <w:pStyle w:val="ListeMaddemi"/>
-      </w:pPr>
-      <w:r>
-        <w:t xml:space="preserve">Bu </w:t>
-      </w:r>
-      <w:proofErr w:type="spellStart"/>
-      <w:r>
-        <w:t>ekranda</w:t>
-      </w:r>
-      <w:proofErr w:type="spellEnd"/>
-      <w:r>
-        <w:t xml:space="preserve"> </w:t>
-      </w:r>
-      <w:proofErr w:type="spellStart"/>
-      <w:r>
-        <w:t>kişilerden</w:t>
-      </w:r>
-      <w:proofErr w:type="spellEnd"/>
-      <w:r>
-        <w:t xml:space="preserve"> hangi belgelerin isteneceği tanımlanır.</w:t>
-      </w:r>
-    </w:p>
-    <w:p>
-      <w:pPr>
-        <w:pStyle w:val="ListeMaddemi"/>
-      </w:pPr>
-      <w:r>
-        <w:t>Belge adı serbest metin olarak girilir.</w:t>
-      </w:r>
-    </w:p>
-    <w:p>
-      <w:pPr>
-        <w:pStyle w:val="ListeMaddemi"/>
-      </w:pPr>
-      <w:r>
-        <w:t>“Alındı” kontrolü ve gerekiyorsa “geçerlilik tarihi” kontrolü işaretlenir.</w:t>
-      </w:r>
-    </w:p>
-    <w:p>
-      <w:pPr>
-        <w:pStyle w:val="ListeMaddemi"/>
-      </w:pPr>
-      <w:proofErr w:type="spellStart"/>
-      <w:r>
-        <w:t>Belgenin</w:t>
-      </w:r>
-      <w:proofErr w:type="spellEnd"/>
-      <w:r>
-        <w:t xml:space="preserve"> hangi </w:t>
-      </w:r>
-      <w:proofErr w:type="spellStart"/>
-      <w:r>
-        <w:rPr>
-          <w:b/>
-          <w:bCs/>
-        </w:rPr>
-        <w:t>Z</w:t>
-      </w:r>
-      <w:r>
-        <w:rPr>
-          <w:b/>
-          <w:bCs/>
-        </w:rPr>
-        <w:t>iyaret</w:t>
-      </w:r>
-      <w:proofErr w:type="spellEnd"/>
-      <w:r>
-        <w:rPr>
-          <w:b/>
-          <w:bCs/>
-        </w:rPr>
-        <w:t xml:space="preserve"> </w:t>
-      </w:r>
-      <w:proofErr w:type="spellStart"/>
-      <w:r>
-        <w:rPr>
-          <w:b/>
-          <w:bCs/>
-        </w:rPr>
-        <w:t>S</w:t>
-      </w:r>
-      <w:r>
-        <w:rPr>
-          <w:b/>
-          <w:bCs/>
-        </w:rPr>
-        <w:t>ebepleri</w:t>
-      </w:r>
-      <w:proofErr w:type="spellEnd"/>
-      <w:r>
-        <w:t xml:space="preserve"> </w:t>
-      </w:r>
-      <w:proofErr w:type="spellStart"/>
-      <w:r>
-        <w:t>için</w:t>
-      </w:r>
-      <w:proofErr w:type="spellEnd"/>
-      <w:r>
-        <w:t xml:space="preserve"> </w:t>
-      </w:r>
-      <w:proofErr w:type="spellStart"/>
-      <w:r>
-        <w:t>geçerli</w:t>
-      </w:r>
-      <w:proofErr w:type="spellEnd"/>
-      <w:r>
-        <w:t xml:space="preserve"> </w:t>
-      </w:r>
-      <w:proofErr w:type="spellStart"/>
-      <w:r>
-        <w:t>olduğu</w:t>
-      </w:r>
-      <w:proofErr w:type="spellEnd"/>
-      <w:r>
-        <w:t xml:space="preserve"> işaretlenir (Çalışma, Görüşme, Keşif, Kontrol, Malzeme Alma, Malzeme Bırakma, İskele Kurma).</w:t>
-      </w:r>
-    </w:p>
-    <w:p>
-      <w:pPr>
-        <w:pStyle w:val="ListeMaddemi"/>
-      </w:pPr>
-      <w:r>
-        <w:t xml:space="preserve">Aktif/Pasif durumu işaretlenir; pasif </w:t>
-      </w:r>
-      <w:proofErr w:type="spellStart"/>
-      <w:r>
-        <w:t>kurallar</w:t>
-      </w:r>
-      <w:proofErr w:type="spellEnd"/>
-      <w:r>
-        <w:t xml:space="preserve"> </w:t>
-      </w:r>
-      <w:proofErr w:type="spellStart"/>
-      <w:r>
-        <w:t>kişi</w:t>
-      </w:r>
-      <w:proofErr w:type="spellEnd"/>
-      <w:r>
-        <w:t xml:space="preserve"> </w:t>
-      </w:r>
-      <w:proofErr w:type="spellStart"/>
-      <w:r>
-        <w:t>formunda</w:t>
-      </w:r>
-      <w:proofErr w:type="spellEnd"/>
-      <w:r>
-        <w:t xml:space="preserve"> </w:t>
-      </w:r>
-      <w:proofErr w:type="spellStart"/>
-      <w:r>
-        <w:t>görünmez</w:t>
-      </w:r>
-      <w:proofErr w:type="spellEnd"/>
-      <w:r>
-        <w:t>.</w:t>
-      </w:r>
-    </w:p>
-    <w:p>
-      <w:pPr>
-        <w:pStyle w:val="ListeMaddemi"/>
-        <w:numPr>
-          <w:ilvl w:val="0"/>
-          <w:numId w:val="0"/>
-        </w:numPr>
-        <w:ind w:left="360"/>
+        <w:rPr>
+          <w:lang w:val="tr-TR"/>
+        </w:rPr>
       </w:pPr>
     </w:p>
     <w:p>
@@ -2215,10 +1843,14 @@
         </w:numPr>
         <w:ind w:left="360"/>
         <w:jc w:val="center"/>
+        <w:rPr>
+          <w:lang w:val="tr-TR"/>
+        </w:rPr>
       </w:pPr>
       <w:r>
         <w:rPr>
           <w:noProof/>
+          <w:lang w:val="tr-TR"/>
         </w:rPr>
         <w:drawing>
           <wp:inline distT="0" distB="0" distL="0" distR="0" wp14:anchorId="739C28A3" wp14:editId="295FF793">
@@ -2260,36 +1892,49 @@
     <w:p>
       <w:pPr>
         <w:pStyle w:val="Balk1"/>
-      </w:pPr>
-      <w:r>
+        <w:rPr>
+          <w:lang w:val="tr-TR"/>
+        </w:rPr>
+      </w:pPr>
+      <w:r>
+        <w:rPr>
+          <w:lang w:val="tr-TR"/>
+        </w:rPr>
         <w:t>7. Araç Belgeleri (Kural Tanımı)</w:t>
       </w:r>
     </w:p>
     <w:p>
       <w:pPr>
         <w:pStyle w:val="ListeMaddemi"/>
-      </w:pPr>
-      <w:r>
+        <w:rPr>
+          <w:lang w:val="tr-TR"/>
+        </w:rPr>
+      </w:pPr>
+      <w:r>
+        <w:rPr>
+          <w:lang w:val="tr-TR"/>
+        </w:rPr>
         <w:t>Kişi Belgeleri ile aynı mantıkta çalışır.</w:t>
       </w:r>
     </w:p>
     <w:p>
       <w:pPr>
         <w:pStyle w:val="ListeMaddemi"/>
-      </w:pPr>
-      <w:proofErr w:type="spellStart"/>
-      <w:r>
-        <w:t>Belgenin</w:t>
-      </w:r>
-      <w:proofErr w:type="spellEnd"/>
-      <w:r>
-        <w:t xml:space="preserve"> hangi </w:t>
-      </w:r>
-      <w:proofErr w:type="spellStart"/>
+        <w:rPr>
+          <w:lang w:val="tr-TR"/>
+        </w:rPr>
+      </w:pPr>
+      <w:r>
+        <w:rPr>
+          <w:lang w:val="tr-TR"/>
+        </w:rPr>
+        <w:t xml:space="preserve">Belgenin hangi </w:t>
+      </w:r>
       <w:r>
         <w:rPr>
           <w:b/>
           <w:bCs/>
+          <w:lang w:val="tr-TR"/>
         </w:rPr>
         <w:t>A</w:t>
       </w:r>
@@ -2297,67 +1942,31 @@
         <w:rPr>
           <w:b/>
           <w:bCs/>
-        </w:rPr>
-        <w:t>raç</w:t>
-      </w:r>
-      <w:proofErr w:type="spellEnd"/>
+          <w:lang w:val="tr-TR"/>
+        </w:rPr>
+        <w:t xml:space="preserve">raç </w:t>
+      </w:r>
       <w:r>
         <w:rPr>
           <w:b/>
           <w:bCs/>
-        </w:rPr>
-        <w:t xml:space="preserve"> </w:t>
-      </w:r>
-      <w:proofErr w:type="spellStart"/>
+          <w:lang w:val="tr-TR"/>
+        </w:rPr>
+        <w:t>T</w:t>
+      </w:r>
       <w:r>
         <w:rPr>
           <w:b/>
           <w:bCs/>
-        </w:rPr>
-        <w:t>T</w:t>
-      </w:r>
-      <w:r>
-        <w:rPr>
-          <w:b/>
-          <w:bCs/>
+          <w:lang w:val="tr-TR"/>
         </w:rPr>
         <w:t>ürleri</w:t>
       </w:r>
-      <w:proofErr w:type="spellEnd"/>
-      <w:r>
-        <w:t xml:space="preserve"> </w:t>
-      </w:r>
-      <w:proofErr w:type="spellStart"/>
-      <w:r>
-        <w:t>için</w:t>
-      </w:r>
-      <w:proofErr w:type="spellEnd"/>
-      <w:r>
-        <w:t xml:space="preserve"> </w:t>
-      </w:r>
-      <w:proofErr w:type="spellStart"/>
-      <w:r>
-        <w:t>geçerli</w:t>
-      </w:r>
-      <w:proofErr w:type="spellEnd"/>
-      <w:r>
-        <w:t xml:space="preserve"> </w:t>
-      </w:r>
-      <w:proofErr w:type="spellStart"/>
-      <w:r>
-        <w:t>olduğu</w:t>
-      </w:r>
-      <w:proofErr w:type="spellEnd"/>
-      <w:r>
-        <w:t xml:space="preserve"> </w:t>
-      </w:r>
-      <w:proofErr w:type="spellStart"/>
-      <w:r>
-        <w:t>işaretlenir</w:t>
-      </w:r>
-      <w:proofErr w:type="spellEnd"/>
-      <w:r>
-        <w:t>.</w:t>
+      <w:r>
+        <w:rPr>
+          <w:lang w:val="tr-TR"/>
+        </w:rPr>
+        <w:t xml:space="preserve"> için geçerli olduğu işaretlenir.</w:t>
       </w:r>
     </w:p>
     <w:p>
@@ -2368,6 +1977,9 @@
           <w:numId w:val="0"/>
         </w:numPr>
         <w:ind w:left="360"/>
+        <w:rPr>
+          <w:lang w:val="tr-TR"/>
+        </w:rPr>
       </w:pPr>
     </w:p>
     <w:p>
@@ -2379,10 +1991,14 @@
         </w:numPr>
         <w:ind w:left="360"/>
         <w:jc w:val="center"/>
+        <w:rPr>
+          <w:lang w:val="tr-TR"/>
+        </w:rPr>
       </w:pPr>
       <w:r>
         <w:rPr>
           <w:noProof/>
+          <w:lang w:val="tr-TR"/>
         </w:rPr>
         <w:drawing>
           <wp:inline distT="0" distB="0" distL="0" distR="0" wp14:anchorId="273F7635" wp14:editId="25BF9E28">
@@ -2424,8 +2040,14 @@
     <w:p>
       <w:pPr>
         <w:pStyle w:val="Balk1"/>
-      </w:pPr>
-      <w:r>
+        <w:rPr>
+          <w:lang w:val="tr-TR"/>
+        </w:rPr>
+      </w:pPr>
+      <w:r>
+        <w:rPr>
+          <w:lang w:val="tr-TR"/>
+        </w:rPr>
         <w:lastRenderedPageBreak/>
         <w:t>8. Kullanıcılar (Yalnızca Yönetici)</w:t>
       </w:r>
@@ -2433,420 +2055,1225 @@
     <w:p>
       <w:pPr>
         <w:pStyle w:val="ListeMaddemi"/>
-      </w:pPr>
-      <w:r>
+        <w:rPr>
+          <w:lang w:val="tr-TR"/>
+        </w:rPr>
+      </w:pPr>
+      <w:r>
+        <w:rPr>
+          <w:lang w:val="tr-TR"/>
+        </w:rPr>
         <w:t>Sisteme giriş yapabilecek kullanıcılar bu ekranda yönetilir.</w:t>
       </w:r>
     </w:p>
     <w:p>
       <w:pPr>
         <w:pStyle w:val="ListeMaddemi"/>
-      </w:pPr>
-      <w:r>
-        <w:t>“+ Yeni Kullanıcı” ile e-posta, şifre ve rol belirlenir.</w:t>
+        <w:rPr>
+          <w:lang w:val="tr-TR"/>
+        </w:rPr>
+      </w:pPr>
+      <w:r>
+        <w:rPr>
+          <w:lang w:val="tr-TR"/>
+        </w:rPr>
+        <w:t xml:space="preserve">“+ Yeni Kullanıcı” ile Kullanıcı Adı, Ad </w:t>
+      </w:r>
+      <w:proofErr w:type="spellStart"/>
+      <w:r>
+        <w:rPr>
+          <w:lang w:val="tr-TR"/>
+        </w:rPr>
+        <w:t>Soyad</w:t>
+      </w:r>
+      <w:proofErr w:type="spellEnd"/>
+      <w:r>
+        <w:rPr>
+          <w:lang w:val="tr-TR"/>
+        </w:rPr>
+        <w:t>, E-posta, şifre ve rol belirlenir.</w:t>
       </w:r>
     </w:p>
     <w:p>
       <w:pPr>
         <w:pStyle w:val="ListeMaddemi"/>
-      </w:pPr>
-      <w:r>
-        <w:t>Roller: Yönetici, Saha Kontrolörü, Güvenlik.</w:t>
+        <w:rPr>
+          <w:lang w:val="tr-TR"/>
+        </w:rPr>
+      </w:pPr>
+      <w:r>
+        <w:rPr>
+          <w:lang w:val="tr-TR"/>
+        </w:rPr>
+        <w:t>Girişte Kullanıcı Adı kullanılır; e-posta yalnızca iletişim bilgisidir ve birden fazla kullanıcıda aynı olabilir.</w:t>
       </w:r>
     </w:p>
     <w:p>
       <w:pPr>
         <w:pStyle w:val="ListeMaddemi"/>
-      </w:pPr>
-      <w:r>
-        <w:t>Düzenle butonuyla kullanıcının rolü ve Aktif/Pasif durumu değiştirilir.</w:t>
+        <w:rPr>
+          <w:lang w:val="tr-TR"/>
+        </w:rPr>
+      </w:pPr>
+      <w:r>
+        <w:rPr>
+          <w:lang w:val="tr-TR"/>
+        </w:rPr>
+        <w:t>Roller: Yönetici, Saha Kontrolörü, Güvenlik, Ön Büro.</w:t>
       </w:r>
     </w:p>
     <w:p>
       <w:pPr>
         <w:pStyle w:val="ListeMaddemi"/>
-      </w:pPr>
-      <w:r>
+        <w:rPr>
+          <w:lang w:val="tr-TR"/>
+        </w:rPr>
+      </w:pPr>
+      <w:r>
+        <w:rPr>
+          <w:lang w:val="tr-TR"/>
+        </w:rPr>
+        <w:t xml:space="preserve">Düzenle butonuyla kullanıcının Ad </w:t>
+      </w:r>
+      <w:proofErr w:type="spellStart"/>
+      <w:r>
+        <w:rPr>
+          <w:lang w:val="tr-TR"/>
+        </w:rPr>
+        <w:t>Soyad</w:t>
+      </w:r>
+      <w:proofErr w:type="spellEnd"/>
+      <w:r>
+        <w:rPr>
+          <w:lang w:val="tr-TR"/>
+        </w:rPr>
+        <w:t>, E-posta, rol ve Aktif/Pasif bilgileri değiştirilir; Kullanıcı Adı değiştirilemez.</w:t>
+      </w:r>
+    </w:p>
+    <w:p>
+      <w:pPr>
+        <w:pStyle w:val="ListeMaddemi"/>
+        <w:rPr>
+          <w:lang w:val="tr-TR"/>
+        </w:rPr>
+      </w:pPr>
+      <w:r>
+        <w:rPr>
+          <w:lang w:val="tr-TR"/>
+        </w:rPr>
         <w:t>Pasif yapılan kullanıcı sisteme giriş yapamaz.</w:t>
       </w:r>
     </w:p>
     <w:p>
       <w:pPr>
         <w:pStyle w:val="ListeMaddemi"/>
-      </w:pPr>
-      <w:r>
-        <w:t xml:space="preserve">“Şifre Sıfırla” ile </w:t>
+        <w:rPr>
+          <w:lang w:val="tr-TR"/>
+        </w:rPr>
+      </w:pPr>
+      <w:r>
+        <w:rPr>
+          <w:lang w:val="tr-TR"/>
+        </w:rPr>
+        <w:t>“Şifre Sıfırla” ile kullanıcıya yeni şifre belirlenir.</w:t>
+      </w:r>
+    </w:p>
+    <w:p>
+      <w:pPr>
+        <w:pStyle w:val="ListeMaddemi"/>
+        <w:rPr>
+          <w:lang w:val="tr-TR"/>
+        </w:rPr>
+      </w:pPr>
+      <w:r>
+        <w:rPr>
+          <w:lang w:val="tr-TR"/>
+        </w:rPr>
+        <w:t>“Sil” butonuyla kullanıcı silinir; silmeden önce onay istenir.</w:t>
+      </w:r>
+    </w:p>
+    <w:p>
+      <w:pPr>
+        <w:pStyle w:val="ListeMaddemi"/>
+        <w:rPr>
+          <w:lang w:val="tr-TR"/>
+        </w:rPr>
+      </w:pPr>
+      <w:r>
+        <w:rPr>
+          <w:lang w:val="tr-TR"/>
+        </w:rPr>
+        <w:t>Kendi hesabınızı ve sistemde kalan son Yönetici hesabını silemezsiniz.</w:t>
+      </w:r>
+    </w:p>
+    <w:p>
+      <w:pPr>
+        <w:pStyle w:val="ListeMaddemi"/>
+        <w:rPr>
+          <w:lang w:val="tr-TR"/>
+        </w:rPr>
+      </w:pPr>
+      <w:r>
+        <w:rPr>
+          <w:b/>
+          <w:lang w:val="tr-TR"/>
+        </w:rPr>
+        <w:t xml:space="preserve">Yönetici: </w:t>
+      </w:r>
+      <w:r>
+        <w:rPr>
+          <w:lang w:val="tr-TR"/>
+        </w:rPr>
+        <w:t>Her şey</w:t>
+      </w:r>
+    </w:p>
+    <w:p>
+      <w:pPr>
+        <w:pStyle w:val="ListeMaddemi"/>
+        <w:rPr>
+          <w:lang w:val="tr-TR"/>
+        </w:rPr>
+      </w:pPr>
+      <w:r>
+        <w:rPr>
+          <w:b/>
+          <w:lang w:val="tr-TR"/>
+        </w:rPr>
+        <w:t xml:space="preserve">Güvenlik: </w:t>
+      </w:r>
+      <w:r>
+        <w:rPr>
+          <w:lang w:val="tr-TR"/>
+        </w:rPr>
+        <w:t>Board, Çekek Takip, Kişiler, Araçlar</w:t>
+      </w:r>
+    </w:p>
+    <w:p>
+      <w:pPr>
+        <w:pStyle w:val="ListeMaddemi"/>
+        <w:rPr>
+          <w:lang w:val="tr-TR"/>
+        </w:rPr>
+      </w:pPr>
+      <w:r>
+        <w:rPr>
+          <w:b/>
+          <w:lang w:val="tr-TR"/>
+        </w:rPr>
+        <w:t xml:space="preserve">Saha Kontrolörü: </w:t>
+      </w:r>
+      <w:r>
+        <w:rPr>
+          <w:lang w:val="tr-TR"/>
+        </w:rPr>
+        <w:t>Kullanıcılar hariç her şey</w:t>
+      </w:r>
+    </w:p>
+    <w:p>
+      <w:pPr>
+        <w:pStyle w:val="ListeMaddemi"/>
+        <w:rPr>
+          <w:lang w:val="tr-TR"/>
+        </w:rPr>
+      </w:pPr>
+      <w:r>
+        <w:rPr>
+          <w:b/>
+          <w:lang w:val="tr-TR"/>
+        </w:rPr>
+        <w:t xml:space="preserve">Ön Büro: </w:t>
+      </w:r>
+      <w:r>
+        <w:rPr>
+          <w:lang w:val="tr-TR"/>
+        </w:rPr>
+        <w:t>Board (yalnızca izleme; “+15 dk” ve “Çıkış” butonları görünmez), Takip Raporu, Kişiler Raporu</w:t>
+      </w:r>
+    </w:p>
+    <w:p>
+      <w:pPr>
+        <w:pStyle w:val="Balk1"/>
+        <w:rPr>
+          <w:lang w:val="tr-TR"/>
+        </w:rPr>
+      </w:pPr>
+      <w:r>
+        <w:rPr>
+          <w:lang w:val="tr-TR"/>
+        </w:rPr>
+        <w:t>9. Ortak Kullanım İpuçları</w:t>
+      </w:r>
+    </w:p>
+    <w:p>
+      <w:pPr>
+        <w:pStyle w:val="ListeMaddemi"/>
+        <w:rPr>
+          <w:lang w:val="tr-TR"/>
+        </w:rPr>
+      </w:pPr>
+      <w:r>
+        <w:rPr>
+          <w:lang w:val="tr-TR"/>
+        </w:rPr>
+        <w:t>Yeni kayıt veya düzenleme formu açıkken liste gizlenir, kayıt bitince tekrar görünür.</w:t>
+      </w:r>
+    </w:p>
+    <w:p>
+      <w:pPr>
+        <w:pStyle w:val="ListeMaddemi"/>
+        <w:rPr>
+          <w:lang w:val="tr-TR"/>
+        </w:rPr>
+      </w:pPr>
+      <w:r>
+        <w:rPr>
+          <w:lang w:val="tr-TR"/>
+        </w:rPr>
+        <w:t>Kaydet ve Kapat butonları formun üstünde sabit durur, form uzun olsa da kaybolmaz.</w:t>
+      </w:r>
+    </w:p>
+    <w:p>
+      <w:pPr>
+        <w:pStyle w:val="ListeMaddemi"/>
+        <w:rPr>
+          <w:lang w:val="tr-TR"/>
+        </w:rPr>
+      </w:pPr>
+      <w:r>
+        <w:rPr>
+          <w:lang w:val="tr-TR"/>
+        </w:rPr>
+        <w:t>Kayıt sonucu (başarılı/uyarı) mesajı butonların altında görünür.</w:t>
+      </w:r>
+    </w:p>
+    <w:p>
+      <w:pPr>
+        <w:pStyle w:val="ListeMaddemi"/>
+        <w:rPr>
+          <w:lang w:val="tr-TR"/>
+        </w:rPr>
+      </w:pPr>
+      <w:r>
+        <w:rPr>
+          <w:lang w:val="tr-TR"/>
+        </w:rPr>
+        <w:t>Arama kutuları yazmayı bıraktığınız anda arar. Kişiler, Araçlar ve Tekneler ekranlarında liste yalnızca arama yapılınca gelir.</w:t>
+      </w:r>
+    </w:p>
+    <w:p>
+      <w:pPr>
+        <w:pStyle w:val="ListeMaddemi"/>
+        <w:rPr>
+          <w:lang w:val="tr-TR"/>
+        </w:rPr>
+      </w:pPr>
+      <w:r>
+        <w:rPr>
+          <w:lang w:val="tr-TR"/>
+        </w:rPr>
+        <w:t>Sütun başlığına tıklamak listeyi sıralar, tekrar tıklamak sırayı ters çevirir.</w:t>
+      </w:r>
+    </w:p>
+    <w:p>
+      <w:pPr>
+        <w:pStyle w:val="Balk1"/>
+        <w:rPr>
+          <w:lang w:val="tr-TR"/>
+        </w:rPr>
+      </w:pPr>
+      <w:r>
+        <w:rPr>
+          <w:lang w:val="tr-TR"/>
+        </w:rPr>
+        <w:t>10. Çekek Takip</w:t>
+      </w:r>
+    </w:p>
+    <w:p>
+      <w:pPr>
+        <w:pStyle w:val="ListeMaddemi"/>
+        <w:rPr>
+          <w:lang w:val="tr-TR"/>
+        </w:rPr>
+      </w:pPr>
+      <w:r>
+        <w:rPr>
+          <w:lang w:val="tr-TR"/>
+        </w:rPr>
+        <w:t>Sahaya giren/çıkan kişi ve araçlar bu ekranda kontrolden geçirilip kaydedilir.</w:t>
+      </w:r>
+    </w:p>
+    <w:p>
+      <w:pPr>
+        <w:pStyle w:val="ListeMaddemi"/>
+        <w:rPr>
+          <w:lang w:val="tr-TR"/>
+        </w:rPr>
+      </w:pPr>
+      <w:r>
+        <w:rPr>
+          <w:lang w:val="tr-TR"/>
+        </w:rPr>
+        <w:t>Kimlik Numarası (kişi) ve/veya Takip Numarası (araç) girilir — en az biri dolu olmalı, ikisi birlikte de girilebilir.</w:t>
+      </w:r>
+    </w:p>
+    <w:p>
+      <w:pPr>
+        <w:pStyle w:val="ListeMaddemi"/>
+        <w:rPr>
+          <w:lang w:val="tr-TR"/>
+        </w:rPr>
+      </w:pPr>
+      <w:r>
+        <w:rPr>
+          <w:lang w:val="tr-TR"/>
+        </w:rPr>
+        <w:t>Ziyaret Sebebi seçilir (Çalışma, Görüşme, Keşif, Kontrol, Malzeme Alma, Malzeme Bırakma, İskele Kurma).</w:t>
+      </w:r>
+    </w:p>
+    <w:p>
+      <w:pPr>
+        <w:pStyle w:val="ListeMaddemi"/>
+        <w:rPr>
+          <w:lang w:val="tr-TR"/>
+        </w:rPr>
+      </w:pPr>
+      <w:r>
+        <w:rPr>
+          <w:lang w:val="tr-TR"/>
+        </w:rPr>
+        <w:t>Kimlik/Takip numarası yazarken eşleşen kayıtlar listelenir, seçilince alan otomatik tamamlanır.</w:t>
+      </w:r>
+    </w:p>
+    <w:p>
+      <w:pPr>
+        <w:pStyle w:val="ListeMaddemi"/>
+        <w:rPr>
+          <w:lang w:val="tr-TR"/>
+        </w:rPr>
+      </w:pPr>
+      <w:r>
+        <w:rPr>
+          <w:lang w:val="tr-TR"/>
+        </w:rPr>
+        <w:t>Kimlik Numarası alanının yanındaki kamera butonuyla tabletin kamerasından barkod okutulabilir; okunan numara alana otomatik yazılır. El tipi barkod okuyucu da kullanılabilir.</w:t>
+      </w:r>
+    </w:p>
+    <w:p>
+      <w:pPr>
+        <w:pStyle w:val="ListeMaddemi"/>
+        <w:rPr>
+          <w:lang w:val="tr-TR"/>
+        </w:rPr>
+      </w:pPr>
+      <w:r>
+        <w:rPr>
+          <w:lang w:val="tr-TR"/>
+        </w:rPr>
+        <w:t>Kamera açılamazsa (izin verilmemişse veya cihazda kamera yoksa) ekranda kırmızı bir uyarı gösterilir; bu durumda numarayı elle girin.</w:t>
+      </w:r>
+    </w:p>
+    <w:p>
+      <w:pPr>
+        <w:pStyle w:val="ListeMaddemi"/>
+        <w:rPr>
+          <w:lang w:val="tr-TR"/>
+        </w:rPr>
+      </w:pPr>
+      <w:r>
+        <w:rPr>
+          <w:lang w:val="tr-TR"/>
+        </w:rPr>
+        <w:lastRenderedPageBreak/>
+        <w:t xml:space="preserve">“Kontrol” butonuna basılınca kişi ve/veya araç için ayrı ayrı kontrol yapılır: kayıtlı mı, aktif mi, yasaklı mı, açık (çıkışsız) bir kaydı var mı, eksik/süresi geçmiş belge var </w:t>
+      </w:r>
+      <w:proofErr w:type="gramStart"/>
+      <w:r>
+        <w:rPr>
+          <w:lang w:val="tr-TR"/>
+        </w:rPr>
+        <w:t>mı.</w:t>
+      </w:r>
+      <w:proofErr w:type="gramEnd"/>
+    </w:p>
+    <w:p>
+      <w:pPr>
+        <w:pStyle w:val="ListeMaddemi"/>
+        <w:rPr>
+          <w:lang w:val="tr-TR"/>
+        </w:rPr>
+      </w:pPr>
+      <w:r>
+        <w:rPr>
+          <w:lang w:val="tr-TR"/>
+        </w:rPr>
+        <w:t>Herhangi bir sorun varsa ekranda uyarı gösterilir, gerekirse ilgili tanım ekranına yönlendirme linki sunulur.</w:t>
+      </w:r>
+    </w:p>
+    <w:p>
+      <w:pPr>
+        <w:pStyle w:val="ListeMaddemi"/>
+        <w:rPr>
+          <w:lang w:val="tr-TR"/>
+        </w:rPr>
+      </w:pPr>
+      <w:r>
+        <w:rPr>
+          <w:lang w:val="tr-TR"/>
+        </w:rPr>
+        <w:t>Kişi ve araçtan biri kontrolü geçerse, diğeri geçmese bile geçen taraf yine de kaydedilebilir.</w:t>
+      </w:r>
+    </w:p>
+    <w:p>
+      <w:pPr>
+        <w:pStyle w:val="ListeMaddemi"/>
+        <w:rPr>
+          <w:lang w:val="tr-TR"/>
+        </w:rPr>
+      </w:pPr>
+      <w:r>
+        <w:rPr>
+          <w:lang w:val="tr-TR"/>
+        </w:rPr>
+        <w:t xml:space="preserve">Kontrolden geçilince Onay ekranı açılır: Ad </w:t>
       </w:r>
       <w:proofErr w:type="spellStart"/>
       <w:r>
-        <w:t>kullanıcıya</w:t>
+        <w:rPr>
+          <w:lang w:val="tr-TR"/>
+        </w:rPr>
+        <w:t>Soyad</w:t>
       </w:r>
       <w:proofErr w:type="spellEnd"/>
       <w:r>
-        <w:t xml:space="preserve"> yeni </w:t>
+        <w:rPr>
+          <w:lang w:val="tr-TR"/>
+        </w:rPr>
+        <w:t xml:space="preserve"> (varsa, salt okunur), Firma Adı, Telefon, Tekne, Açıklama girilir/düzenlenir.</w:t>
+      </w:r>
+    </w:p>
+    <w:p>
+      <w:pPr>
+        <w:pStyle w:val="ListeMaddemi"/>
+        <w:rPr>
+          <w:lang w:val="tr-TR"/>
+        </w:rPr>
+      </w:pPr>
+      <w:r>
+        <w:rPr>
+          <w:lang w:val="tr-TR"/>
+        </w:rPr>
+        <w:t>Tekne ve Telefon zorunludur. Tekne, arama kutusuna kod veya ad yazılıp listeden seçilerek belirlenir.</w:t>
+      </w:r>
+    </w:p>
+    <w:p>
+      <w:pPr>
+        <w:pStyle w:val="ListeMaddemi"/>
+        <w:rPr>
+          <w:lang w:val="tr-TR"/>
+        </w:rPr>
+      </w:pPr>
+      <w:r>
+        <w:rPr>
+          <w:lang w:val="tr-TR"/>
+        </w:rPr>
+        <w:t>Onay ekranında değiştirilen Firma Adı ve Telefon yalnızca o girişe kaydedilir; kişinin/aracın kalıcı bilgileri Kişiler veya Araçlar ekranından güncellenir.</w:t>
+      </w:r>
+    </w:p>
+    <w:p>
+      <w:pPr>
+        <w:pStyle w:val="ListeMaddemi"/>
+        <w:rPr>
+          <w:lang w:val="tr-TR"/>
+        </w:rPr>
+      </w:pPr>
+      <w:r>
+        <w:rPr>
+          <w:lang w:val="tr-TR"/>
+        </w:rPr>
+        <w:t>Bitişine 10 gün veya daha az kalmış belgeler varsa Onay ekranında sarı bir hatırlatma kutusunda gösterilir.</w:t>
+      </w:r>
+    </w:p>
+    <w:p>
+      <w:pPr>
+        <w:pStyle w:val="ListeMaddemi"/>
+        <w:rPr>
+          <w:lang w:val="tr-TR"/>
+        </w:rPr>
+      </w:pPr>
+      <w:r>
+        <w:rPr>
+          <w:lang w:val="tr-TR"/>
+        </w:rPr>
+        <w:t>“Giriş Kaydet” ile kayıt tamamlanır, ekran otomatik olarak yeni sorguya hazır hale döner (hızlı art arda giriş için).</w:t>
+      </w:r>
+    </w:p>
+    <w:p>
+      <w:pPr>
+        <w:pStyle w:val="ListeMaddemi"/>
+        <w:rPr>
+          <w:lang w:val="tr-TR"/>
+        </w:rPr>
+      </w:pPr>
+      <w:r>
+        <w:rPr>
+          <w:lang w:val="tr-TR"/>
+        </w:rPr>
+        <w:t>Her girişten sonra Ziyaret Sebebi varsayılan olarak “</w:t>
       </w:r>
       <w:proofErr w:type="spellStart"/>
       <w:r>
-        <w:t>şifre</w:t>
+        <w:rPr>
+          <w:lang w:val="tr-TR"/>
+        </w:rPr>
+        <w:t>Çalışma”ya</w:t>
       </w:r>
       <w:proofErr w:type="spellEnd"/>
       <w:r>
-        <w:t xml:space="preserve"> </w:t>
+        <w:rPr>
+          <w:lang w:val="tr-TR"/>
+        </w:rPr>
+        <w:t xml:space="preserve"> döner.</w:t>
+      </w:r>
+    </w:p>
+    <w:p>
+      <w:pPr>
+        <w:pStyle w:val="ListeMaddemi"/>
+        <w:rPr>
+          <w:lang w:val="tr-TR"/>
+        </w:rPr>
+      </w:pPr>
+      <w:r>
+        <w:rPr>
+          <w:lang w:val="tr-TR"/>
+        </w:rPr>
+        <w:t>Kişi girişlerinde süre Ziyaret Sebebine göre belirlenir: Çalışma, Görüşme ve İskele Kurma süresiz; Keşif ve Kontrol 1 saat; Malzeme Alma ve Malzeme Bırakma 15 dakika.</w:t>
+      </w:r>
+    </w:p>
+    <w:p>
+      <w:pPr>
+        <w:pStyle w:val="ListeMaddemi"/>
+        <w:rPr>
+          <w:lang w:val="tr-TR"/>
+        </w:rPr>
+      </w:pPr>
+      <w:r>
+        <w:rPr>
+          <w:lang w:val="tr-TR"/>
+        </w:rPr>
+        <w:t>Araç girişlerinde süre araç türüne göre belirlenir: Vinç ve Vidanjör süresiz, diğer tüm araç türleri 15 dakika (Ziyaret Sebebi süreyi etkilemez).</w:t>
+      </w:r>
+    </w:p>
+    <w:p>
+      <w:pPr>
+        <w:pStyle w:val="ListeMaddemi"/>
+        <w:numPr>
+          <w:ilvl w:val="0"/>
+          <w:numId w:val="0"/>
+        </w:numPr>
+        <w:ind w:left="360"/>
+        <w:rPr>
+          <w:lang w:val="tr-TR"/>
+        </w:rPr>
+      </w:pPr>
+    </w:p>
+    <w:p>
+      <w:pPr>
+        <w:pStyle w:val="ListeMaddemi"/>
+        <w:numPr>
+          <w:ilvl w:val="0"/>
+          <w:numId w:val="0"/>
+        </w:numPr>
+        <w:ind w:left="360"/>
+        <w:jc w:val="center"/>
+        <w:rPr>
+          <w:lang w:val="tr-TR"/>
+        </w:rPr>
+      </w:pPr>
+      <w:r>
+        <w:rPr>
+          <w:noProof/>
+        </w:rPr>
+        <w:drawing>
+          <wp:inline distT="0" distB="0" distL="0" distR="0" wp14:anchorId="5774F8BB" wp14:editId="26E7DBB2">
+            <wp:extent cx="4538110" cy="1771650"/>
+            <wp:effectExtent l="0" t="0" r="0" b="0"/>
+            <wp:docPr id="156295846" name="Resim 1"/>
+            <wp:cNvGraphicFramePr>
+              <a:graphicFrameLocks xmlns:a="http://schemas.openxmlformats.org/drawingml/2006/main" noChangeAspect="1"/>
+            </wp:cNvGraphicFramePr>
+            <a:graphic xmlns:a="http://schemas.openxmlformats.org/drawingml/2006/main">
+              <a:graphicData uri="http://schemas.openxmlformats.org/drawingml/2006/picture">
+                <pic:pic xmlns:pic="http://schemas.openxmlformats.org/drawingml/2006/picture">
+                  <pic:nvPicPr>
+                    <pic:cNvPr id="156295846" name=""/>
+                    <pic:cNvPicPr/>
+                  </pic:nvPicPr>
+                  <pic:blipFill>
+                    <a:blip r:embed="rId14"/>
+                    <a:stretch>
+                      <a:fillRect/>
+                    </a:stretch>
+                  </pic:blipFill>
+                  <pic:spPr>
+                    <a:xfrm>
+                      <a:off x="0" y="0"/>
+                      <a:ext cx="4572940" cy="1785247"/>
+                    </a:xfrm>
+                    <a:prstGeom prst="rect">
+                      <a:avLst/>
+                    </a:prstGeom>
+                  </pic:spPr>
+                </pic:pic>
+              </a:graphicData>
+            </a:graphic>
+          </wp:inline>
+        </w:drawing>
+      </w:r>
+    </w:p>
+    <w:p>
+      <w:pPr>
+        <w:pStyle w:val="Balk1"/>
+        <w:rPr>
+          <w:lang w:val="tr-TR"/>
+        </w:rPr>
+      </w:pPr>
+      <w:r>
+        <w:rPr>
+          <w:lang w:val="tr-TR"/>
+        </w:rPr>
+        <w:t>11. Board</w:t>
+      </w:r>
+    </w:p>
+    <w:p>
+      <w:pPr>
+        <w:pStyle w:val="ListeMaddemi"/>
+        <w:rPr>
+          <w:lang w:val="tr-TR"/>
+        </w:rPr>
+      </w:pPr>
+      <w:r>
+        <w:rPr>
+          <w:lang w:val="tr-TR"/>
+        </w:rPr>
+        <w:t>Sahada bulunan (henüz çıkışı yapılmamış) kişi ve araçlar bu ekranda listelenir — uygulama açılınca ilk gelen ekrandır.</w:t>
+      </w:r>
+    </w:p>
+    <w:p>
+      <w:pPr>
+        <w:pStyle w:val="ListeMaddemi"/>
+        <w:rPr>
+          <w:lang w:val="tr-TR"/>
+        </w:rPr>
+      </w:pPr>
+      <w:r>
+        <w:rPr>
+          <w:lang w:val="tr-TR"/>
+        </w:rPr>
+        <w:t>Her kayıt bir kart olarak gösterilir; kişi kayıtları mavi, araç kayıtları turuncu simgeyle ayırt edilir.</w:t>
+      </w:r>
+    </w:p>
+    <w:p>
+      <w:pPr>
+        <w:pStyle w:val="ListeMaddemi"/>
+        <w:rPr>
+          <w:lang w:val="tr-TR"/>
+        </w:rPr>
+      </w:pPr>
+      <w:r>
+        <w:rPr>
+          <w:lang w:val="tr-TR"/>
+        </w:rPr>
+        <w:t>Kart üzerinde durum (“İçeride” / “Süresi Geçti”), giriş saati ve kalan/geçen süre rozetleri bulunur.</w:t>
+      </w:r>
+    </w:p>
+    <w:p>
+      <w:pPr>
+        <w:pStyle w:val="ListeMaddemi"/>
+        <w:rPr>
+          <w:lang w:val="tr-TR"/>
+        </w:rPr>
+      </w:pPr>
+      <w:r>
+        <w:rPr>
+          <w:lang w:val="tr-TR"/>
+        </w:rPr>
+        <w:t>Kartta firma adı ve telefon numarası da görünür.</w:t>
+      </w:r>
+    </w:p>
+    <w:p>
+      <w:pPr>
+        <w:pStyle w:val="ListeMaddemi"/>
+        <w:rPr>
+          <w:lang w:val="tr-TR"/>
+        </w:rPr>
+      </w:pPr>
+      <w:r>
+        <w:rPr>
+          <w:lang w:val="tr-TR"/>
+        </w:rPr>
+        <w:t>Süresi 10 dakika veya altına düşen kayıtlar sarı, süresi geçenler kırmızı renkte vurgulanır.</w:t>
+      </w:r>
+    </w:p>
+    <w:p>
+      <w:pPr>
+        <w:pStyle w:val="ListeMaddemi"/>
+        <w:rPr>
+          <w:lang w:val="tr-TR"/>
+        </w:rPr>
+      </w:pPr>
+      <w:r>
+        <w:rPr>
+          <w:lang w:val="tr-TR"/>
+        </w:rPr>
+        <w:lastRenderedPageBreak/>
+        <w:t>Kayıtlar önce süresi en az kalan/en çok geçen üstte, süresiz olanlar ise en eski giren üstte olacak şekilde sıralanır.</w:t>
+      </w:r>
+    </w:p>
+    <w:p>
+      <w:pPr>
+        <w:pStyle w:val="ListeMaddemi"/>
+        <w:rPr>
+          <w:lang w:val="tr-TR"/>
+        </w:rPr>
+      </w:pPr>
+      <w:r>
+        <w:rPr>
+          <w:lang w:val="tr-TR"/>
+        </w:rPr>
+        <w:t xml:space="preserve">Arama kutusuyla ad </w:t>
       </w:r>
       <w:proofErr w:type="spellStart"/>
       <w:r>
-        <w:t>belirlenir</w:t>
+        <w:rPr>
+          <w:lang w:val="tr-TR"/>
+        </w:rPr>
+        <w:t>soyad</w:t>
       </w:r>
       <w:proofErr w:type="spellEnd"/>
       <w:r>
-        <w:t>.</w:t>
+        <w:rPr>
+          <w:lang w:val="tr-TR"/>
+        </w:rPr>
+        <w:t>, kimlik/takip numarası veya firma adına göre filtreleme yapılabilir.</w:t>
       </w:r>
     </w:p>
     <w:p>
       <w:pPr>
         <w:pStyle w:val="ListeMaddemi"/>
-      </w:pPr>
+        <w:rPr>
+          <w:lang w:val="tr-TR"/>
+        </w:rPr>
+      </w:pPr>
+      <w:r>
+        <w:rPr>
+          <w:lang w:val="tr-TR"/>
+        </w:rPr>
+        <w:t>“+15 dk” butonu yalnızca süresi geçmiş kayıtlarda görünür, basılınca süre şu andan itibaren 15 dakika uzatılır.</w:t>
+      </w:r>
+    </w:p>
+    <w:p>
+      <w:pPr>
+        <w:pStyle w:val="ListeMaddemi"/>
+        <w:rPr>
+          <w:lang w:val="tr-TR"/>
+        </w:rPr>
+      </w:pPr>
+      <w:r>
+        <w:rPr>
+          <w:lang w:val="tr-TR"/>
+        </w:rPr>
+        <w:t>“Çıkış” butonuyla kayıt kapatılır, kart listeden kaybolur.</w:t>
+      </w:r>
+    </w:p>
+    <w:p>
+      <w:pPr>
+        <w:pStyle w:val="ListeMaddemi"/>
+        <w:rPr>
+          <w:lang w:val="tr-TR"/>
+        </w:rPr>
+      </w:pPr>
+      <w:r>
+        <w:rPr>
+          <w:lang w:val="tr-TR"/>
+        </w:rPr>
+        <w:t>Keşif veya Kontrol sebebiyle giren bir kişinin süresi dolunca Ziyaret Sebebi otomatik olarak “</w:t>
+      </w:r>
       <w:proofErr w:type="spellStart"/>
       <w:r>
-        <w:t>Güvenlik</w:t>
+        <w:rPr>
+          <w:lang w:val="tr-TR"/>
+        </w:rPr>
+        <w:t>Çalışma”ya</w:t>
       </w:r>
       <w:proofErr w:type="spellEnd"/>
       <w:r>
-        <w:t xml:space="preserve">: </w:t>
+        <w:rPr>
+          <w:lang w:val="tr-TR"/>
+        </w:rPr>
+        <w:t xml:space="preserve"> çevrilir ve Açıklama alanına bununla ilgili bir not eklenir; kart “Süresi Geçti” (kırmızı) olarak kalır.</w:t>
+      </w:r>
+    </w:p>
+    <w:p>
+      <w:pPr>
+        <w:pStyle w:val="ListeMaddemi"/>
+        <w:rPr>
+          <w:lang w:val="tr-TR"/>
+        </w:rPr>
+      </w:pPr>
+      <w:r>
+        <w:rPr>
+          <w:lang w:val="tr-TR"/>
+        </w:rPr>
+        <w:t xml:space="preserve">Ön Büro rolündeki kullanıcılar </w:t>
       </w:r>
       <w:proofErr w:type="spellStart"/>
       <w:r>
-        <w:t>Kişiler</w:t>
+        <w:rPr>
+          <w:lang w:val="tr-TR"/>
+        </w:rPr>
+        <w:t>Board’u</w:t>
       </w:r>
       <w:proofErr w:type="spellEnd"/>
       <w:r>
-        <w:t xml:space="preserve">, </w:t>
+        <w:rPr>
+          <w:lang w:val="tr-TR"/>
+        </w:rPr>
+        <w:t xml:space="preserve"> yalnızca izler; “+15 dk” ve “Çıkış” butonlarını görmez.</w:t>
+      </w:r>
+    </w:p>
+    <w:p>
+      <w:pPr>
+        <w:pStyle w:val="Balk1"/>
+        <w:jc w:val="center"/>
+        <w:rPr>
+          <w:lang w:val="tr-TR"/>
+        </w:rPr>
+      </w:pPr>
+      <w:r>
+        <w:rPr>
+          <w:noProof/>
+        </w:rPr>
+        <w:drawing>
+          <wp:inline distT="0" distB="0" distL="0" distR="0" wp14:anchorId="11F1070A" wp14:editId="05C29844">
+            <wp:extent cx="4489206" cy="2324100"/>
+            <wp:effectExtent l="0" t="0" r="6985" b="0"/>
+            <wp:docPr id="977834180" name="Resim 1"/>
+            <wp:cNvGraphicFramePr>
+              <a:graphicFrameLocks xmlns:a="http://schemas.openxmlformats.org/drawingml/2006/main" noChangeAspect="1"/>
+            </wp:cNvGraphicFramePr>
+            <a:graphic xmlns:a="http://schemas.openxmlformats.org/drawingml/2006/main">
+              <a:graphicData uri="http://schemas.openxmlformats.org/drawingml/2006/picture">
+                <pic:pic xmlns:pic="http://schemas.openxmlformats.org/drawingml/2006/picture">
+                  <pic:nvPicPr>
+                    <pic:cNvPr id="977834180" name=""/>
+                    <pic:cNvPicPr/>
+                  </pic:nvPicPr>
+                  <pic:blipFill>
+                    <a:blip r:embed="rId15"/>
+                    <a:stretch>
+                      <a:fillRect/>
+                    </a:stretch>
+                  </pic:blipFill>
+                  <pic:spPr>
+                    <a:xfrm>
+                      <a:off x="0" y="0"/>
+                      <a:ext cx="4508695" cy="2334189"/>
+                    </a:xfrm>
+                    <a:prstGeom prst="rect">
+                      <a:avLst/>
+                    </a:prstGeom>
+                  </pic:spPr>
+                </pic:pic>
+              </a:graphicData>
+            </a:graphic>
+          </wp:inline>
+        </w:drawing>
+      </w:r>
+    </w:p>
+    <w:p>
+      <w:pPr>
+        <w:rPr>
+          <w:lang w:val="tr-TR"/>
+        </w:rPr>
+      </w:pPr>
+    </w:p>
+    <w:p>
+      <w:pPr>
+        <w:pStyle w:val="Balk1"/>
+        <w:rPr>
+          <w:lang w:val="tr-TR"/>
+        </w:rPr>
+      </w:pPr>
+      <w:r>
+        <w:rPr>
+          <w:lang w:val="tr-TR"/>
+        </w:rPr>
+        <w:t>12. Raporlar</w:t>
+      </w:r>
+    </w:p>
+    <w:p>
+      <w:pPr>
+        <w:pStyle w:val="ListeMaddemi"/>
+        <w:rPr>
+          <w:lang w:val="tr-TR"/>
+        </w:rPr>
+      </w:pPr>
+      <w:r>
+        <w:rPr>
+          <w:lang w:val="tr-TR"/>
+        </w:rPr>
+        <w:t>Filtre alanları doldurulup “Filtrele” butonuna basılır.</w:t>
+      </w:r>
+    </w:p>
+    <w:p>
+      <w:pPr>
+        <w:pStyle w:val="ListeMaddemi"/>
+        <w:rPr>
+          <w:lang w:val="tr-TR"/>
+        </w:rPr>
+      </w:pPr>
+      <w:r>
+        <w:rPr>
+          <w:lang w:val="tr-TR"/>
+        </w:rPr>
+        <w:t>Metin alanlarında “içerir / eşittir / başlar ile”, tarih alanlarında “öncesi / sonrası / eşittir / arası” seçenekleri bulunur.</w:t>
+      </w:r>
+    </w:p>
+    <w:p>
+      <w:pPr>
+        <w:pStyle w:val="ListeMaddemi"/>
+        <w:rPr>
+          <w:lang w:val="tr-TR"/>
+        </w:rPr>
+      </w:pPr>
+      <w:r>
+        <w:rPr>
+          <w:lang w:val="tr-TR"/>
+        </w:rPr>
+        <w:t>Takip Raporu ve Kişiler Raporu’nda ekranda en fazla 1000 kayıt gösterilir; sonuç daha fazlaysa uyarı çıkar. “Excel’e Aktar” ise sonuçların tamamını indirir.</w:t>
+      </w:r>
+    </w:p>
+    <w:p>
+      <w:pPr>
+        <w:pStyle w:val="Balk2"/>
+        <w:rPr>
+          <w:lang w:val="tr-TR"/>
+        </w:rPr>
+      </w:pPr>
+      <w:r>
+        <w:rPr>
+          <w:lang w:val="tr-TR"/>
+        </w:rPr>
+        <w:t>Takip Raporu</w:t>
+      </w:r>
+    </w:p>
+    <w:p>
+      <w:pPr>
+        <w:pStyle w:val="ListeMaddemi"/>
+        <w:rPr>
+          <w:lang w:val="tr-TR"/>
+        </w:rPr>
+      </w:pPr>
+      <w:r>
+        <w:rPr>
+          <w:lang w:val="tr-TR"/>
+        </w:rPr>
+        <w:t>Tüm giriş/çıkış kayıtları listelenir. Yönetici, Saha Kontrolörü ve Ön Büro kullanabilir.</w:t>
+      </w:r>
+    </w:p>
+    <w:p>
+      <w:pPr>
+        <w:pStyle w:val="ListeMaddemi"/>
+        <w:rPr>
+          <w:lang w:val="tr-TR"/>
+        </w:rPr>
+      </w:pPr>
+      <w:r>
+        <w:rPr>
+          <w:lang w:val="tr-TR"/>
+        </w:rPr>
+        <w:t>Sayfa açıldığında bugünün girişleri otomatik gelir.</w:t>
+      </w:r>
+    </w:p>
+    <w:p>
+      <w:pPr>
+        <w:pStyle w:val="ListeMaddemi"/>
+        <w:rPr>
+          <w:lang w:val="tr-TR"/>
+        </w:rPr>
+      </w:pPr>
+      <w:r>
+        <w:rPr>
+          <w:lang w:val="tr-TR"/>
+        </w:rPr>
+        <w:t xml:space="preserve">Filtreler: Kimlik/Takip No, Ad </w:t>
       </w:r>
       <w:proofErr w:type="spellStart"/>
       <w:r>
-        <w:t>Araçlar</w:t>
+        <w:rPr>
+          <w:lang w:val="tr-TR"/>
+        </w:rPr>
+        <w:t>Soyad</w:t>
       </w:r>
       <w:proofErr w:type="spellEnd"/>
       <w:r>
-        <w:t xml:space="preserve">, </w:t>
+        <w:rPr>
+          <w:lang w:val="tr-TR"/>
+        </w:rPr>
+        <w:t>, Firma Adı, Telefon, Araç Türü, Tekne (arama ile seçilir), Ziyaret Sebebi, Giriş/Çıkış Tarihi, Durum, Açıklama, Kaydeden.</w:t>
+      </w:r>
+    </w:p>
+    <w:p>
+      <w:pPr>
+        <w:pStyle w:val="ListeMaddemi"/>
+        <w:rPr>
+          <w:lang w:val="tr-TR"/>
+        </w:rPr>
+      </w:pPr>
+      <w:r>
+        <w:rPr>
+          <w:lang w:val="tr-TR"/>
+        </w:rPr>
+        <w:t>Yönetici dışındaki roller yalnızca son 1 yıl içindeki kayıtları görebilir.</w:t>
+      </w:r>
+    </w:p>
+    <w:p>
+      <w:pPr>
+        <w:pStyle w:val="Balk2"/>
+        <w:rPr>
+          <w:lang w:val="tr-TR"/>
+        </w:rPr>
+      </w:pPr>
+      <w:r>
+        <w:rPr>
+          <w:lang w:val="tr-TR"/>
+        </w:rPr>
+        <w:lastRenderedPageBreak/>
+        <w:t>Kişiler Raporu</w:t>
+      </w:r>
+    </w:p>
+    <w:p>
+      <w:pPr>
+        <w:pStyle w:val="ListeMaddemi"/>
+        <w:rPr>
+          <w:lang w:val="tr-TR"/>
+        </w:rPr>
+      </w:pPr>
+      <w:r>
+        <w:rPr>
+          <w:lang w:val="tr-TR"/>
+        </w:rPr>
+        <w:t>Kayıtlı tüm kişiler filtrelenerek listelenir. Yönetici, Saha Kontrolörü ve Ön Büro kullanabilir.</w:t>
+      </w:r>
+    </w:p>
+    <w:p>
+      <w:pPr>
+        <w:pStyle w:val="ListeMaddemi"/>
+        <w:rPr>
+          <w:lang w:val="tr-TR"/>
+        </w:rPr>
+      </w:pPr>
+      <w:r>
+        <w:rPr>
+          <w:lang w:val="tr-TR"/>
+        </w:rPr>
+        <w:t xml:space="preserve">Filtreler: Kimlik No, Ad </w:t>
       </w:r>
       <w:proofErr w:type="spellStart"/>
       <w:r>
-        <w:t>Girişler</w:t>
+        <w:rPr>
+          <w:lang w:val="tr-TR"/>
+        </w:rPr>
+        <w:t>Soyad</w:t>
       </w:r>
       <w:proofErr w:type="spellEnd"/>
+      <w:r>
+        <w:rPr>
+          <w:lang w:val="tr-TR"/>
+        </w:rPr>
+        <w:t>, Firma Adı, Telefon, Aktif, KVKK Onay Durumu, KVKK Onay Formu Alındı, KVKK Onay Tarihi, Kaptan, Tekne Sahibi.</w:t>
+      </w:r>
     </w:p>
     <w:p>
       <w:pPr>
         <w:pStyle w:val="ListeMaddemi"/>
-      </w:pPr>
-      <w:r>
-        <w:t xml:space="preserve">Saha </w:t>
+        <w:rPr>
+          <w:lang w:val="tr-TR"/>
+        </w:rPr>
+      </w:pPr>
+      <w:r>
+        <w:rPr>
+          <w:lang w:val="tr-TR"/>
+        </w:rPr>
+        <w:t>Açılışta liste boş gelir, “</w:t>
       </w:r>
       <w:proofErr w:type="spellStart"/>
       <w:r>
-        <w:t>Kontrolü</w:t>
+        <w:rPr>
+          <w:lang w:val="tr-TR"/>
+        </w:rPr>
+        <w:t>Filtrele”ye</w:t>
       </w:r>
       <w:proofErr w:type="spellEnd"/>
       <w:r>
-        <w:t xml:space="preserve">: </w:t>
-      </w:r>
-      <w:proofErr w:type="spellStart"/>
-      <w:r>
-        <w:t>Kullanıcılar</w:t>
-      </w:r>
-      <w:proofErr w:type="spellEnd"/>
-      <w:r>
-        <w:t xml:space="preserve"> </w:t>
-      </w:r>
-      <w:proofErr w:type="spellStart"/>
-      <w:r>
-        <w:t>hariç</w:t>
-      </w:r>
-      <w:proofErr w:type="spellEnd"/>
-      <w:r>
-        <w:t xml:space="preserve"> </w:t>
-      </w:r>
-      <w:proofErr w:type="spellStart"/>
-      <w:r>
-        <w:t>herşey</w:t>
-      </w:r>
-      <w:proofErr w:type="spellEnd"/>
-    </w:p>
-    <w:p>
-      <w:pPr>
-        <w:pStyle w:val="Balk1"/>
-      </w:pPr>
-      <w:r>
-        <w:t>9. Ortak Kullanım İpuçları</w:t>
+        <w:rPr>
+          <w:lang w:val="tr-TR"/>
+        </w:rPr>
+        <w:t xml:space="preserve"> basılınca dolar. Sonuçlar ad soyada göre sıralanır.</w:t>
+      </w:r>
+    </w:p>
+    <w:p>
+      <w:pPr>
+        <w:pStyle w:val="Balk2"/>
+        <w:rPr>
+          <w:lang w:val="tr-TR"/>
+        </w:rPr>
+      </w:pPr>
+      <w:r>
+        <w:rPr>
+          <w:lang w:val="tr-TR"/>
+        </w:rPr>
+        <w:t>Tekneler Raporu</w:t>
       </w:r>
     </w:p>
     <w:p>
       <w:pPr>
         <w:pStyle w:val="ListeMaddemi"/>
-      </w:pPr>
-      <w:r>
-        <w:t>Yeni kayıt veya düzenleme formu açıkken liste gizlenir, kayıt bitince tekrar görünür.</w:t>
+        <w:rPr>
+          <w:lang w:val="tr-TR"/>
+        </w:rPr>
+      </w:pPr>
+      <w:r>
+        <w:rPr>
+          <w:lang w:val="tr-TR"/>
+        </w:rPr>
+        <w:t>Tüm tekneler filtrelenerek listelenir. Yönetici ve Saha Kontrolörü kullanabilir.</w:t>
       </w:r>
     </w:p>
     <w:p>
       <w:pPr>
         <w:pStyle w:val="ListeMaddemi"/>
-      </w:pPr>
-      <w:r>
-        <w:t>Kaydet ve Kapat butonları formun üstünde sabit durur, form uzun olsa da kaybolmaz.</w:t>
-      </w:r>
-    </w:p>
-    <w:p>
-      <w:pPr>
-        <w:pStyle w:val="ListeMaddemi"/>
-      </w:pPr>
-      <w:r>
-        <w:t>Kayıt sonucu (başarılı/uyarı) mesajı butonların altında görünür.</w:t>
-      </w:r>
-    </w:p>
-    <w:p>
-      <w:pPr>
-        <w:pStyle w:val="ListeMaddemi"/>
-      </w:pPr>
-      <w:r>
-        <w:t>Arama kutuları yazdıkça anında filtreler.</w:t>
-      </w:r>
-    </w:p>
-    <w:p>
-      <w:pPr>
-        <w:pStyle w:val="ListeMaddemi"/>
-      </w:pPr>
-      <w:r>
-        <w:t>Sütun başlığına tıklamak listeyi sıralar, tekrar tıklamak sırayı ters çevirir.</w:t>
-      </w:r>
-    </w:p>
-    <w:p>
+        <w:rPr>
+          <w:lang w:val="tr-TR"/>
+        </w:rPr>
+      </w:pPr>
+      <w:r>
+        <w:rPr>
+          <w:lang w:val="tr-TR"/>
+        </w:rPr>
+        <w:t>Filtreler: Tekne Kodu, Tekne Adı, Aktif/Pasif.</w:t>
+      </w:r>
+    </w:p>
+    <w:p>
+      <w:pPr>
+        <w:rPr>
+          <w:lang w:val="tr-TR"/>
+        </w:rPr>
+      </w:pPr>
       <w:r>
         <w:rPr>
           <w:i/>
-        </w:rPr>
-        <w:br/>
-      </w:r>
-    </w:p>
-    <w:p>
-      <w:pPr>
-        <w:pStyle w:val="Balk1"/>
-      </w:pPr>
-      <w:r>
-        <w:t>10. Çekek Takip</w:t>
-      </w:r>
-    </w:p>
-    <w:p>
-      <w:pPr>
-        <w:pStyle w:val="ListeMaddemi"/>
-      </w:pPr>
-      <w:r>
-        <w:t>Sahaya giren/çıkan kişi ve araçlar bu ekranda kontrolden geçirilip kaydedilir.</w:t>
-      </w:r>
-    </w:p>
-    <w:p>
-      <w:pPr>
-        <w:pStyle w:val="ListeMaddemi"/>
-      </w:pPr>
-      <w:r>
-        <w:t>Kimlik Numarası (kişi) ve/veya Takip Numarası (araç) girilir — en az biri dolu olmalı, ikisi birlikte de girilebilir.</w:t>
-      </w:r>
-    </w:p>
-    <w:p>
-      <w:pPr>
-        <w:pStyle w:val="ListeMaddemi"/>
-      </w:pPr>
-      <w:r>
-        <w:t>Ziyaret Sebebi seçilir (Çalışma, Görüşme, Keşif, Kontrol, Malzeme Alma, Malzeme Bırakma, İskele Kurma).</w:t>
-      </w:r>
-    </w:p>
-    <w:p>
-      <w:pPr>
-        <w:pStyle w:val="ListeMaddemi"/>
-      </w:pPr>
-      <w:r>
-        <w:t>Kimlik/Takip numarası yazarken eşleşen kayıtlar listelenir, seçilince alan otomatik tamamlanır.</w:t>
-      </w:r>
-    </w:p>
-    <w:p>
-      <w:pPr>
-        <w:pStyle w:val="ListeMaddemi"/>
-      </w:pPr>
-      <w:r>
-        <w:t>“Kontrol” butonuna basılınca kişi ve/veya araç için ayrı ayrı kontrol yapılır: kayıtlı mı, aktif mi, yasaklı mı, açık (çıkışsız) bir kaydı var mı, eksik/süresi geçmiş belge var mı.</w:t>
-      </w:r>
-    </w:p>
-    <w:p>
-      <w:pPr>
-        <w:pStyle w:val="ListeMaddemi"/>
-      </w:pPr>
-      <w:r>
-        <w:t>Herhangi bir sorun varsa ekranda uyarı gösterilir, gerekirse ilgili tanım ekranına yönlendirme linki sunulur.</w:t>
-      </w:r>
-    </w:p>
-    <w:p>
-      <w:pPr>
-        <w:pStyle w:val="ListeMaddemi"/>
-      </w:pPr>
-      <w:r>
-        <w:t>Kişi ve araçtan biri kontrolü geçerse, diğeri geçmese bile geçen taraf yine de kaydedilebilir.</w:t>
-      </w:r>
-    </w:p>
-    <w:p>
-      <w:pPr>
-        <w:pStyle w:val="ListeMaddemi"/>
-      </w:pPr>
-      <w:r>
-        <w:t>Kontrolden geçilince Onay ekranı açılır: Ad Soyad (varsa, salt okunur), Firma Adı, Telefon, Tekne, Açıklama girilir/düzenlenir.</w:t>
-      </w:r>
-    </w:p>
-    <w:p>
-      <w:pPr>
-        <w:pStyle w:val="ListeMaddemi"/>
-      </w:pPr>
-      <w:r>
-        <w:t>Bitişine 10 gün veya daha az kalmış belgeler varsa Onay ekranında sarı bir hatırlatma kutusunda gösterilir.</w:t>
-      </w:r>
-    </w:p>
-    <w:p>
-      <w:pPr>
-        <w:pStyle w:val="ListeMaddemi"/>
-      </w:pPr>
-      <w:r>
-        <w:t>“Giriş Kaydet” ile kayıt tamamlanır, ekran otomatik olarak yeni sorguya hazır hale döner (hızlı art arda giriş için).</w:t>
-      </w:r>
-    </w:p>
-    <w:p>
-      <w:pPr>
-        <w:spacing w:before="120" w:after="240"/>
-        <w:pBdr>
-          <w:top w:val="single" w:sz="6" w:space="4" w:color="AAAAAA"/>
-          <w:left w:val="single" w:sz="6" w:space="4" w:color="AAAAAA"/>
-          <w:bottom w:val="single" w:sz="6" w:space="4" w:color="AAAAAA"/>
-          <w:right w:val="single" w:sz="6" w:space="4" w:color="AAAAAA"/>
-        </w:pBdr>
-      </w:pPr>
-      <w:r>
-        <w:rPr>
-          <w:i/>
-          <w:color w:val="808080"/>
-        </w:rPr>
-        <w:t>[EKRAN GÖRÜNTÜSÜ: Çekek Takip sorgu ekranı]</w:t>
-      </w:r>
-    </w:p>
-    <w:p>
-      <w:pPr>
-        <w:spacing w:before="120" w:after="240"/>
-        <w:pBdr>
-          <w:top w:val="single" w:sz="6" w:space="4" w:color="AAAAAA"/>
-          <w:left w:val="single" w:sz="6" w:space="4" w:color="AAAAAA"/>
-          <w:bottom w:val="single" w:sz="6" w:space="4" w:color="AAAAAA"/>
-          <w:right w:val="single" w:sz="6" w:space="4" w:color="AAAAAA"/>
-        </w:pBdr>
-      </w:pPr>
-      <w:r>
-        <w:rPr>
-          <w:i/>
-          <w:color w:val="808080"/>
-        </w:rPr>
-        <w:t>[EKRAN GÖRÜNTÜSÜ: Çekek Takip onay ekranı]</w:t>
-      </w:r>
-    </w:p>
-    <w:p>
-      <w:pPr>
-        <w:pStyle w:val="Balk1"/>
-      </w:pPr>
-      <w:r>
-        <w:t>11. Board</w:t>
-      </w:r>
-    </w:p>
-    <w:p>
-      <w:pPr>
-        <w:pStyle w:val="ListeMaddemi"/>
-      </w:pPr>
-      <w:r>
-        <w:t>Sahada bulunan (henüz çıkışı yapılmamış) kişi ve araçlar bu ekranda listelenir — uygulama açılınca ilk gelen ekrandır.</w:t>
-      </w:r>
-    </w:p>
-    <w:p>
-      <w:pPr>
-        <w:pStyle w:val="ListeMaddemi"/>
-      </w:pPr>
-      <w:r>
-        <w:t>Her kayıt bir kart olarak gösterilir; kişi kayıtları mavi, araç kayıtları turuncu simgeyle ayırt edilir.</w:t>
-      </w:r>
-    </w:p>
-    <w:p>
-      <w:pPr>
-        <w:pStyle w:val="ListeMaddemi"/>
-      </w:pPr>
-      <w:r>
-        <w:t>Kart üzerinde durum (“İçeride” / “Süresi Geçti”), giriş saati ve kalan/geçen süre rozetleri bulunur.</w:t>
-      </w:r>
-    </w:p>
-    <w:p>
-      <w:pPr>
-        <w:pStyle w:val="ListeMaddemi"/>
-      </w:pPr>
-      <w:r>
-        <w:t>Süresi 10 dakika veya altına düşen kayıtlar sarı, süresi geçenler kırmızı renkte vurgulanır.</w:t>
-      </w:r>
-    </w:p>
-    <w:p>
-      <w:pPr>
-        <w:pStyle w:val="ListeMaddemi"/>
-      </w:pPr>
-      <w:r>
-        <w:t>Kayıtlar önce süresi en az kalan/en çok geçen üstte, süresiz olanlar ise en eski giren üstte olacak şekilde sıralanır.</w:t>
-      </w:r>
-    </w:p>
-    <w:p>
-      <w:pPr>
-        <w:pStyle w:val="ListeMaddemi"/>
-      </w:pPr>
-      <w:r>
-        <w:t>Arama kutusuyla ad soyad, kimlik/takip numarası veya firma adına göre filtreleme yapılabilir.</w:t>
-      </w:r>
-    </w:p>
-    <w:p>
-      <w:pPr>
-        <w:pStyle w:val="ListeMaddemi"/>
-      </w:pPr>
-      <w:r>
-        <w:t>“+15 dk” butonu yalnızca süresi geçmiş kayıtlarda görünür, basılınca süre şu andan itibaren 15 dakika uzatılır.</w:t>
-      </w:r>
-    </w:p>
-    <w:p>
-      <w:pPr>
-        <w:pStyle w:val="ListeMaddemi"/>
-      </w:pPr>
-      <w:r>
-        <w:t>“Çıkış” butonuyla kayıt kapatılır, kart listeden kaybolur.</w:t>
-      </w:r>
-    </w:p>
-    <w:p>
-      <w:pPr>
-        <w:spacing w:before="120" w:after="240"/>
-        <w:pBdr>
-          <w:top w:val="single" w:sz="6" w:space="4" w:color="AAAAAA"/>
-          <w:left w:val="single" w:sz="6" w:space="4" w:color="AAAAAA"/>
-          <w:bottom w:val="single" w:sz="6" w:space="4" w:color="AAAAAA"/>
-          <w:right w:val="single" w:sz="6" w:space="4" w:color="AAAAAA"/>
-        </w:pBdr>
-      </w:pPr>
-      <w:r>
-        <w:rPr>
-          <w:i/>
-          <w:color w:val="808080"/>
-        </w:rPr>
-        <w:t>[EKRAN GÖRÜNTÜSÜ: Çekek Board ekranı]</w:t>
-      </w:r>
-    </w:p>
-    <w:p>
-      <w:r>
-        <w:rPr>
-          <w:i/>
+          <w:lang w:val="tr-TR"/>
         </w:rPr>
         <w:br/>
         <w:t>Bu kılavuz, uygulamaya yeni ekranlar eklendikçe güncellenecektir.</w:t>
@@ -2863,7 +3290,7 @@
 </file>
 
 <file path=word/numbering.xml><?xml version="1.0" encoding="utf-8"?>
-<w:numbering xmlns:wpc="http://schemas.microsoft.com/office/word/2010/wordprocessingCanvas" xmlns:cx="http://schemas.microsoft.com/office/drawing/2014/chartex" xmlns:cx1="http://schemas.microsoft.com/office/drawing/2015/9/8/chartex" xmlns:cx2="http://schemas.microsoft.com/office/drawing/2015/10/21/chartex" xmlns:cx3="http://schemas.microsoft.com/office/drawing/2016/5/9/chartex" xmlns:cx4="http://schemas.microsoft.com/office/drawing/2016/5/10/chartex" xmlns:cx5="http://schemas.microsoft.com/office/drawing/2016/5/11/chartex" xmlns:cx6="http://schemas.microsoft.com/office/drawing/2016/5/12/chartex" xmlns:cx7="http://schemas.microsoft.com/office/drawing/2016/5/13/chartex" xmlns:cx8="http://schemas.microsoft.com/office/drawing/2016/5/14/chartex" xmlns:mc="http://schemas.openxmlformats.org/markup-compatibility/2006" xmlns:aink="http://schemas.microsoft.com/office/drawing/2016/ink" xmlns:am3d="http://schemas.microsoft.com/office/drawing/2017/model3d" xmlns:o="urn:schemas-microsoft-com:office:office" xmlns:oel="http://schemas.microsoft.com/office/2019/extlst" xmlns:r="http://schemas.openxmlformats.org/officeDocument/2006/relationships" xmlns:m="http://schemas.openxmlformats.org/officeDocument/2006/math" xmlns:v="urn:schemas-microsoft-com:vml" xmlns:wp14="http://schemas.microsoft.com/office/word/2010/wordprocessingDrawing" xmlns:wp="http://schemas.openxmlformats.org/drawingml/2006/wordprocessingDrawing" xmlns:w10="urn:schemas-microsoft-com:office:word" xmlns:w="http://schemas.openxmlformats.org/wordprocessingml/2006/main" xmlns:w14="http://schemas.microsoft.com/office/word/2010/wordml" xmlns:w15="http://schemas.microsoft.com/office/word/2012/wordml" xmlns:w16cei="http://schemas.microsoft.com/office/word/2026/wordml/cei" xmlns:w16cex="http://schemas.microsoft.com/office/word/2018/wordml/cex" xmlns:w16cid="http://schemas.microsoft.com/office/word/2016/wordml/cid" xmlns:w16="http://schemas.microsoft.com/office/word/2018/wordml" xmlns:w16du="http://schemas.microsoft.com/office/word/2023/wordml/word16du" xmlns:w16sdtdh="http://schemas.microsoft.com/office/word/2020/wordml/sdtdatahash" xmlns:w16sdtfl="http://schemas.microsoft.com/office/word/2024/wordml/sdtformatlock" xmlns:w16se="http://schemas.microsoft.com/office/word/2015/wordml/symex" xmlns:wpg="http://schemas.microsoft.com/office/word/2010/wordprocessingGroup" xmlns:wpi="http://schemas.microsoft.com/office/word/2010/wordprocessingInk" xmlns:wne="http://schemas.microsoft.com/office/word/2006/wordml" xmlns:wps="http://schemas.microsoft.com/office/word/2010/wordprocessingShape" mc:Ignorable="w14 w15 w16se w16cid w16 w16cex w16sdtdh w16sdtfl w16du wp14">
+<w:numbering xmlns:wpc="http://schemas.microsoft.com/office/word/2010/wordprocessingCanvas" xmlns:cx="http://schemas.microsoft.com/office/drawing/2014/chartex" xmlns:cx1="http://schemas.microsoft.com/office/drawing/2015/9/8/chartex" xmlns:cx2="http://schemas.microsoft.com/office/drawing/2015/10/21/chartex" xmlns:cx3="http://schemas.microsoft.com/office/drawing/2016/5/9/chartex" xmlns:cx4="http://schemas.microsoft.com/office/drawing/2016/5/10/chartex" xmlns:cx5="http://schemas.microsoft.com/office/drawing/2016/5/11/chartex" xmlns:cx6="http://schemas.microsoft.com/office/drawing/2016/5/12/chartex" xmlns:cx7="http://schemas.microsoft.com/office/drawing/2016/5/13/chartex" xmlns:cx8="http://schemas.microsoft.com/office/drawing/2016/5/14/chartex" xmlns:mc="http://schemas.openxmlformats.org/markup-compatibility/2006" xmlns:aink="http://schemas.microsoft.com/office/drawing/2016/ink" xmlns:am3d="http://schemas.microsoft.com/office/drawing/2017/model3d" xmlns:o="urn:schemas-microsoft-com:office:office" xmlns:oel="http://schemas.microsoft.com/office/2019/extlst" xmlns:r="http://schemas.openxmlformats.org/officeDocument/2006/relationships" xmlns:m="http://schemas.openxmlformats.org/officeDocument/2006/math" xmlns:v="urn:schemas-microsoft-com:vml" xmlns:wp14="http://schemas.microsoft.com/office/word/2010/wordprocessingDrawing" xmlns:wp="http://schemas.openxmlformats.org/drawingml/2006/wordprocessingDrawing" xmlns:w10="urn:schemas-microsoft-com:office:word" xmlns:w="http://schemas.openxmlformats.org/wordprocessingml/2006/main" xmlns:w14="http://schemas.microsoft.com/office/word/2010/wordml" xmlns:w15="http://schemas.microsoft.com/office/word/2012/wordml" xmlns:w16cex="http://schemas.microsoft.com/office/word/2018/wordml/cex" xmlns:w16cid="http://schemas.microsoft.com/office/word/2016/wordml/cid" xmlns:w16="http://schemas.microsoft.com/office/word/2018/wordml" xmlns:w16du="http://schemas.microsoft.com/office/word/2023/wordml/word16du" xmlns:w16sdtdh="http://schemas.microsoft.com/office/word/2020/wordml/sdtdatahash" xmlns:w16sdtfl="http://schemas.microsoft.com/office/word/2024/wordml/sdtformatlock" xmlns:w16se="http://schemas.microsoft.com/office/word/2015/wordml/symex" xmlns:wpg="http://schemas.microsoft.com/office/word/2010/wordprocessingGroup" xmlns:wpi="http://schemas.microsoft.com/office/word/2010/wordprocessingInk" xmlns:wne="http://schemas.microsoft.com/office/word/2006/wordml" xmlns:wps="http://schemas.microsoft.com/office/word/2010/wordprocessingShape" mc:Ignorable="w14 w15 w16se w16cid w16 w16cex w16sdtdh w16sdtfl w16du wp14">
   <w:abstractNum w:abstractNumId="0" w15:restartNumberingAfterBreak="0">
     <w:nsid w:val="FFFFFF7C"/>
     <w:multiLevelType w:val="singleLevel"/>

</xml_diff>